<commit_message>
Keep the Case X document to the sections its template defines
The template has one figure in Product Perspective, none inside a use case,
and three parts to its traceability appendix. This document had grown a
container diagram, a sequence diagram, and a fourth appendix section holding
verification results — none of which the template provides a slot for.

Removed all three. The verification results they held are already reported
in chapter 4 tables 4.15 and 4.16, so nothing is lost. Figures renumbered to
1-7 and the QA record updated to match what the document now contains.

Co-Authored-By: Claude Opus 5 <noreply@anthropic.com>
Claude-Session: https://claude.ai/code/session_01VK1RWMhqrGAHMFf4HNf3qn
</commit_message>
<xml_diff>
--- a/Documents/UseCase_SRS_SOML_ENGSE206_v1.0_TH.docx
+++ b/Documents/UseCase_SRS_SOML_ENGSE206_v1.0_TH.docx
@@ -2261,7 +2261,7 @@
     </w:p>
     <w:bookmarkEnd w:id="18"/>
     <w:bookmarkEnd w:id="19"/>
-    <w:bookmarkStart w:id="34" w:name="overall-description"/>
+    <w:bookmarkStart w:id="31" w:name="overall-description"/>
     <w:p>
       <w:pPr>
         <w:pStyle w:val="Heading1"/>
@@ -2270,7 +2270,7 @@
         <w:t xml:space="preserve">2. Overall Description</w:t>
       </w:r>
     </w:p>
-    <w:bookmarkStart w:id="26" w:name="product-perspective"/>
+    <w:bookmarkStart w:id="23" w:name="product-perspective"/>
     <w:p>
       <w:pPr>
         <w:pStyle w:val="Heading2"/>
@@ -2362,75 +2362,8 @@
         <w:t xml:space="preserve">ภาพที่ 1 — System Context และขอบเขตความรับผิดชอบของระบบ SOML</w:t>
       </w:r>
     </w:p>
-    <w:p>
-      <w:pPr>
-        <w:pStyle w:val="CaptionedFigure"/>
-      </w:pPr>
-      <w:r>
-        <w:drawing>
-          <wp:inline>
-            <wp:extent cx="5334000" cy="5913648"/>
-            <wp:effectExtent b="0" l="0" r="0" t="0"/>
-            <wp:docPr descr="แผนภาพคอนเทนเนอร์" title="" id="24" name="Picture"/>
-            <a:graphic>
-              <a:graphicData uri="http://schemas.openxmlformats.org/drawingml/2006/picture">
-                <pic:pic>
-                  <pic:nvPicPr>
-                    <pic:cNvPr descr="assets/diagrams/fig3-03_c2_container.png" id="25" name="Picture"/>
-                    <pic:cNvPicPr>
-                      <a:picLocks noChangeArrowheads="1" noChangeAspect="1"/>
-                    </pic:cNvPicPr>
-                  </pic:nvPicPr>
-                  <pic:blipFill>
-                    <a:blip r:embed="rId23"/>
-                    <a:stretch>
-                      <a:fillRect/>
-                    </a:stretch>
-                  </pic:blipFill>
-                  <pic:spPr bwMode="auto">
-                    <a:xfrm>
-                      <a:off x="0" y="0"/>
-                      <a:ext cx="5334000" cy="5913648"/>
-                    </a:xfrm>
-                    <a:prstGeom prst="rect">
-                      <a:avLst/>
-                    </a:prstGeom>
-                    <a:noFill/>
-                    <a:ln w="9525">
-                      <a:noFill/>
-                      <a:headEnd/>
-                      <a:tailEnd/>
-                    </a:ln>
-                  </pic:spPr>
-                </pic:pic>
-              </a:graphicData>
-            </a:graphic>
-          </wp:inline>
-        </w:drawing>
-      </w:r>
-    </w:p>
-    <w:p>
-      <w:pPr>
-        <w:pStyle w:val="ImageCaption"/>
-      </w:pPr>
-      <w:r>
-        <w:t xml:space="preserve">แผนภาพคอนเทนเนอร์</w:t>
-      </w:r>
-    </w:p>
-    <w:p>
-      <w:pPr>
-        <w:pStyle w:val="BodyText"/>
-      </w:pPr>
-      <w:r>
-        <w:rPr>
-          <w:i/>
-          <w:iCs/>
-        </w:rPr>
-        <w:t xml:space="preserve">ภาพที่ 2 — Container View แสดงส่วนที่ติดตั้งแยกจากกันสี่ส่วนและช่องทางสื่อสารระหว่างกัน</w:t>
-      </w:r>
-    </w:p>
-    <w:bookmarkEnd w:id="26"/>
-    <w:bookmarkStart w:id="28" w:name="product-functions"/>
+    <w:bookmarkEnd w:id="23"/>
+    <w:bookmarkStart w:id="25" w:name="product-functions"/>
     <w:p>
       <w:pPr>
         <w:pStyle w:val="Heading2"/>
@@ -2770,7 +2703,7 @@
         </w:tc>
       </w:tr>
     </w:tbl>
-    <w:bookmarkStart w:id="27" w:name="user-story-summary"/>
+    <w:bookmarkStart w:id="24" w:name="user-story-summary"/>
     <w:p>
       <w:pPr>
         <w:pStyle w:val="Heading3"/>
@@ -3040,9 +2973,9 @@
         </w:tc>
       </w:tr>
     </w:tbl>
-    <w:bookmarkEnd w:id="27"/>
-    <w:bookmarkEnd w:id="28"/>
-    <w:bookmarkStart w:id="29" w:name="user-classes-and-characteristics"/>
+    <w:bookmarkEnd w:id="24"/>
+    <w:bookmarkEnd w:id="25"/>
+    <w:bookmarkStart w:id="26" w:name="user-classes-and-characteristics"/>
     <w:p>
       <w:pPr>
         <w:pStyle w:val="Heading2"/>
@@ -3215,8 +3148,8 @@
         <w:t xml:space="preserve">สิทธิ์ระดับผู้ดูแลระบบรวมอยู่ในบทบาทผู้จัดการ ไม่มีบทบาทที่สี่แยกต่างหาก เนื่องจากขนาดของร้านไม่จำเป็นต้องแยก</w:t>
       </w:r>
     </w:p>
-    <w:bookmarkEnd w:id="29"/>
-    <w:bookmarkStart w:id="30" w:name="operating-environment"/>
+    <w:bookmarkEnd w:id="26"/>
+    <w:bookmarkStart w:id="27" w:name="operating-environment"/>
     <w:p>
       <w:pPr>
         <w:pStyle w:val="Heading2"/>
@@ -3408,8 +3341,8 @@
         </w:tc>
       </w:tr>
     </w:tbl>
-    <w:bookmarkEnd w:id="30"/>
-    <w:bookmarkStart w:id="31" w:name="design-and-implementation-constraints"/>
+    <w:bookmarkEnd w:id="27"/>
+    <w:bookmarkStart w:id="28" w:name="design-and-implementation-constraints"/>
     <w:p>
       <w:pPr>
         <w:pStyle w:val="Heading2"/>
@@ -3749,8 +3682,8 @@
         </w:tc>
       </w:tr>
     </w:tbl>
-    <w:bookmarkEnd w:id="31"/>
-    <w:bookmarkStart w:id="32" w:name="user-documentation"/>
+    <w:bookmarkEnd w:id="28"/>
+    <w:bookmarkStart w:id="29" w:name="user-documentation"/>
     <w:p>
       <w:pPr>
         <w:pStyle w:val="Heading2"/>
@@ -3888,8 +3821,8 @@
         <w:t xml:space="preserve">คู่มือติดตั้งทำหน้าที่เป็นหลักฐานทวนสอบ NFR-09 ด้วย เกณฑ์คือติดตั้งบนเครื่องใหม่ได้สำเร็จโดยใช้เอกสารนี้เพียงอย่างเดียว โดยไม่ต้องแก้ซอร์สโค้ด</w:t>
       </w:r>
     </w:p>
-    <w:bookmarkEnd w:id="32"/>
-    <w:bookmarkStart w:id="33" w:name="assumptions-and-dependencies"/>
+    <w:bookmarkEnd w:id="29"/>
+    <w:bookmarkStart w:id="30" w:name="assumptions-and-dependencies"/>
     <w:p>
       <w:pPr>
         <w:pStyle w:val="Heading2"/>
@@ -4131,9 +4064,9 @@
         </w:pict>
       </w:r>
     </w:p>
-    <w:bookmarkEnd w:id="33"/>
-    <w:bookmarkEnd w:id="34"/>
-    <w:bookmarkStart w:id="39" w:name="external-interface-requirements"/>
+    <w:bookmarkEnd w:id="30"/>
+    <w:bookmarkEnd w:id="31"/>
+    <w:bookmarkStart w:id="36" w:name="external-interface-requirements"/>
     <w:p>
       <w:pPr>
         <w:pStyle w:val="Heading1"/>
@@ -4142,7 +4075,7 @@
         <w:t xml:space="preserve">3. External Interface Requirements</w:t>
       </w:r>
     </w:p>
-    <w:bookmarkStart w:id="35" w:name="user-interfaces"/>
+    <w:bookmarkStart w:id="32" w:name="user-interfaces"/>
     <w:p>
       <w:pPr>
         <w:pStyle w:val="Heading2"/>
@@ -4350,8 +4283,8 @@
         <w:t xml:space="preserve">หน้าจอที่พัฒนาแล้วมีเก้าหน้า ได้แก่ หน้าเข้าสู่ระบบ หน้าขายหน้าร้าน หน้ารับชำระด้วย QR พร้อมเพย์ หน้าคิวรอจ่ายสินค้า หน้ายืนยันจ่ายสินค้า แดชบอร์ดปฏิบัติการ แดชบอร์ดระดับบริหาร หน้าจัดการข้อมูลสินค้า หน้าการแจ้งเตือน และหน้าประวัติการทำรายการ</w:t>
       </w:r>
     </w:p>
-    <w:bookmarkEnd w:id="35"/>
-    <w:bookmarkStart w:id="36" w:name="hardware-interfaces"/>
+    <w:bookmarkEnd w:id="32"/>
+    <w:bookmarkStart w:id="33" w:name="hardware-interfaces"/>
     <w:p>
       <w:pPr>
         <w:pStyle w:val="Heading2"/>
@@ -4646,8 +4579,8 @@
         <w:t xml:space="preserve">ระบบไม่ใช้เครื่องอ่านบาร์โค้ด เครื่องสแกน QR หรือกล้อง ในการยืนยันสิทธิ์รับสินค้าที่คลัง</w:t>
       </w:r>
     </w:p>
-    <w:bookmarkEnd w:id="36"/>
-    <w:bookmarkStart w:id="37" w:name="software-interfaces"/>
+    <w:bookmarkEnd w:id="33"/>
+    <w:bookmarkStart w:id="34" w:name="software-interfaces"/>
     <w:p>
       <w:pPr>
         <w:pStyle w:val="Heading2"/>
@@ -4865,8 +4798,8 @@
         <w:t xml:space="preserve">ระบบไม่เชื่อมต่อ Payment Gateway, API ธนาคาร, ระบบ ERP, ระบบซัพพลายเออร์ภายนอก หรือบริการแจ้งเตือนภายนอกใด ๆ</w:t>
       </w:r>
     </w:p>
-    <w:bookmarkEnd w:id="37"/>
-    <w:bookmarkStart w:id="38" w:name="communications-interfaces"/>
+    <w:bookmarkEnd w:id="34"/>
+    <w:bookmarkStart w:id="35" w:name="communications-interfaces"/>
     <w:p>
       <w:pPr>
         <w:pStyle w:val="Heading2"/>
@@ -5137,9 +5070,9 @@
         </w:pict>
       </w:r>
     </w:p>
-    <w:bookmarkEnd w:id="38"/>
-    <w:bookmarkEnd w:id="39"/>
-    <w:bookmarkStart w:id="105" w:name="system-features"/>
+    <w:bookmarkEnd w:id="35"/>
+    <w:bookmarkEnd w:id="36"/>
+    <w:bookmarkStart w:id="99" w:name="system-features"/>
     <w:p>
       <w:pPr>
         <w:pStyle w:val="Heading1"/>
@@ -5165,18 +5098,18 @@
           <wp:inline>
             <wp:extent cx="5334000" cy="5104306"/>
             <wp:effectExtent b="0" l="0" r="0" t="0"/>
-            <wp:docPr descr="แผนภาพกรณีการใช้งานกลุ่มเข้าสู่ระบบ" title="" id="41" name="Picture"/>
+            <wp:docPr descr="แผนภาพกรณีการใช้งานกลุ่มเข้าสู่ระบบ" title="" id="38" name="Picture"/>
             <a:graphic>
               <a:graphicData uri="http://schemas.openxmlformats.org/drawingml/2006/picture">
                 <pic:pic>
                   <pic:nvPicPr>
-                    <pic:cNvPr descr="assets/diagrams/fig3-06_uc_auth.png" id="42" name="Picture"/>
+                    <pic:cNvPr descr="assets/diagrams/fig3-06_uc_auth.png" id="39" name="Picture"/>
                     <pic:cNvPicPr>
                       <a:picLocks noChangeArrowheads="1" noChangeAspect="1"/>
                     </pic:cNvPicPr>
                   </pic:nvPicPr>
                   <pic:blipFill>
-                    <a:blip r:embed="rId40"/>
+                    <a:blip r:embed="rId37"/>
                     <a:stretch>
                       <a:fillRect/>
                     </a:stretch>
@@ -5220,7 +5153,7 @@
           <w:i/>
           <w:iCs/>
         </w:rPr>
-        <w:t xml:space="preserve">ภาพที่ 3 — Use Case Diagram กลุ่มการเข้าสู่ระบบและการควบคุมสิทธิ์ (UC-01, UC-02)</w:t>
+        <w:t xml:space="preserve">ภาพที่ 2 — Use Case Diagram กลุ่มการเข้าสู่ระบบและการควบคุมสิทธิ์ (UC-01, UC-02)</w:t>
       </w:r>
     </w:p>
     <w:p>
@@ -5232,18 +5165,18 @@
           <wp:inline>
             <wp:extent cx="5334000" cy="3249351"/>
             <wp:effectExtent b="0" l="0" r="0" t="0"/>
-            <wp:docPr descr="แผนภาพกรณีการใช้งานกลุ่มพนักงานขาย" title="" id="44" name="Picture"/>
+            <wp:docPr descr="แผนภาพกรณีการใช้งานกลุ่มพนักงานขาย" title="" id="41" name="Picture"/>
             <a:graphic>
               <a:graphicData uri="http://schemas.openxmlformats.org/drawingml/2006/picture">
                 <pic:pic>
                   <pic:nvPicPr>
-                    <pic:cNvPr descr="assets/diagrams/fig3-07_uc_sales.png" id="45" name="Picture"/>
+                    <pic:cNvPr descr="assets/diagrams/fig3-07_uc_sales.png" id="42" name="Picture"/>
                     <pic:cNvPicPr>
                       <a:picLocks noChangeArrowheads="1" noChangeAspect="1"/>
                     </pic:cNvPicPr>
                   </pic:nvPicPr>
                   <pic:blipFill>
-                    <a:blip r:embed="rId43"/>
+                    <a:blip r:embed="rId40"/>
                     <a:stretch>
                       <a:fillRect/>
                     </a:stretch>
@@ -5287,7 +5220,7 @@
           <w:i/>
           <w:iCs/>
         </w:rPr>
-        <w:t xml:space="preserve">ภาพที่ 4 — Use Case Diagram กลุ่มการขายหน้าร้าน (UC-03, UC-04)</w:t>
+        <w:t xml:space="preserve">ภาพที่ 3 — Use Case Diagram กลุ่มการขายหน้าร้าน (UC-03, UC-04)</w:t>
       </w:r>
     </w:p>
     <w:p>
@@ -5299,18 +5232,18 @@
           <wp:inline>
             <wp:extent cx="5334000" cy="3170207"/>
             <wp:effectExtent b="0" l="0" r="0" t="0"/>
-            <wp:docPr descr="แผนภาพกรณีการใช้งานกลุ่มคลังสินค้า" title="" id="47" name="Picture"/>
+            <wp:docPr descr="แผนภาพกรณีการใช้งานกลุ่มคลังสินค้า" title="" id="44" name="Picture"/>
             <a:graphic>
               <a:graphicData uri="http://schemas.openxmlformats.org/drawingml/2006/picture">
                 <pic:pic>
                   <pic:nvPicPr>
-                    <pic:cNvPr descr="assets/diagrams/fig3-08_uc_warehouse.png" id="48" name="Picture"/>
+                    <pic:cNvPr descr="assets/diagrams/fig3-08_uc_warehouse.png" id="45" name="Picture"/>
                     <pic:cNvPicPr>
                       <a:picLocks noChangeArrowheads="1" noChangeAspect="1"/>
                     </pic:cNvPicPr>
                   </pic:nvPicPr>
                   <pic:blipFill>
-                    <a:blip r:embed="rId46"/>
+                    <a:blip r:embed="rId43"/>
                     <a:stretch>
                       <a:fillRect/>
                     </a:stretch>
@@ -5354,7 +5287,7 @@
           <w:i/>
           <w:iCs/>
         </w:rPr>
-        <w:t xml:space="preserve">ภาพที่ 5 — Use Case Diagram กลุ่มคลังสินค้า (UC-05, UC-06, UC-07)</w:t>
+        <w:t xml:space="preserve">ภาพที่ 4 — Use Case Diagram กลุ่มคลังสินค้า (UC-05, UC-06, UC-07)</w:t>
       </w:r>
     </w:p>
     <w:p>
@@ -5366,18 +5299,18 @@
           <wp:inline>
             <wp:extent cx="5334000" cy="8862854"/>
             <wp:effectExtent b="0" l="0" r="0" t="0"/>
-            <wp:docPr descr="แผนภาพกรณีการใช้งานกลุ่มผู้จัดการ" title="" id="50" name="Picture"/>
+            <wp:docPr descr="แผนภาพกรณีการใช้งานกลุ่มผู้จัดการ" title="" id="47" name="Picture"/>
             <a:graphic>
               <a:graphicData uri="http://schemas.openxmlformats.org/drawingml/2006/picture">
                 <pic:pic>
                   <pic:nvPicPr>
-                    <pic:cNvPr descr="assets/diagrams/fig3-09_uc_manager.png" id="51" name="Picture"/>
+                    <pic:cNvPr descr="assets/diagrams/fig3-09_uc_manager.png" id="48" name="Picture"/>
                     <pic:cNvPicPr>
                       <a:picLocks noChangeArrowheads="1" noChangeAspect="1"/>
                     </pic:cNvPicPr>
                   </pic:nvPicPr>
                   <pic:blipFill>
-                    <a:blip r:embed="rId49"/>
+                    <a:blip r:embed="rId46"/>
                     <a:stretch>
                       <a:fillRect/>
                     </a:stretch>
@@ -5421,10 +5354,10 @@
           <w:i/>
           <w:iCs/>
         </w:rPr>
-        <w:t xml:space="preserve">ภาพที่ 6 — Use Case Diagram กลุ่มผู้จัดการ (UC-08, UC-09, UC-10, UC-11)</w:t>
-      </w:r>
-    </w:p>
-    <w:bookmarkStart w:id="57" w:name="เขาสระบบและควบคมสทธตามบทบาท-uc-01"/>
+        <w:t xml:space="preserve">ภาพที่ 5 — Use Case Diagram กลุ่มผู้จัดการ (UC-08, UC-09, UC-10, UC-11)</w:t>
+      </w:r>
+    </w:p>
+    <w:bookmarkStart w:id="54" w:name="เขาสระบบและควบคมสทธตามบทบาท-uc-01"/>
     <w:p>
       <w:pPr>
         <w:pStyle w:val="Heading2"/>
@@ -5631,7 +5564,7 @@
         </w:tc>
       </w:tr>
     </w:tbl>
-    <w:bookmarkStart w:id="52" w:name="preconditions"/>
+    <w:bookmarkStart w:id="49" w:name="preconditions"/>
     <w:p>
       <w:pPr>
         <w:pStyle w:val="Heading3"/>
@@ -5664,8 +5597,8 @@
         <w:t xml:space="preserve">เข้าถึงระบบผ่าน HTTPS ตาม CON-08</w:t>
       </w:r>
     </w:p>
-    <w:bookmarkEnd w:id="52"/>
-    <w:bookmarkStart w:id="53" w:name="success-postconditions"/>
+    <w:bookmarkEnd w:id="49"/>
+    <w:bookmarkStart w:id="50" w:name="success-postconditions"/>
     <w:p>
       <w:pPr>
         <w:pStyle w:val="Heading3"/>
@@ -5698,8 +5631,8 @@
         <w:t xml:space="preserve">ระบบบันทึกเหตุการณ์เข้าสู่ระบบลงประวัติการทำรายการพร้อมหมายเลขไอพี</w:t>
       </w:r>
     </w:p>
-    <w:bookmarkEnd w:id="53"/>
-    <w:bookmarkStart w:id="54" w:name="main-success-scenario"/>
+    <w:bookmarkEnd w:id="50"/>
+    <w:bookmarkStart w:id="51" w:name="main-success-scenario"/>
     <w:p>
       <w:pPr>
         <w:pStyle w:val="Heading3"/>
@@ -5768,8 +5701,8 @@
         <w:t xml:space="preserve">ระบบแสดงเมนูตามบทบาทที่ตรวจสอบได้</w:t>
       </w:r>
     </w:p>
-    <w:bookmarkEnd w:id="54"/>
-    <w:bookmarkStart w:id="55" w:name="alternate-flows"/>
+    <w:bookmarkEnd w:id="51"/>
+    <w:bookmarkStart w:id="52" w:name="alternate-flows"/>
     <w:p>
       <w:pPr>
         <w:pStyle w:val="Heading3"/>
@@ -5899,8 +5832,8 @@
         </w:tc>
       </w:tr>
     </w:tbl>
-    <w:bookmarkEnd w:id="55"/>
-    <w:bookmarkStart w:id="56" w:name="exception-flows"/>
+    <w:bookmarkEnd w:id="52"/>
+    <w:bookmarkStart w:id="53" w:name="exception-flows"/>
     <w:p>
       <w:pPr>
         <w:pStyle w:val="Heading3"/>
@@ -6140,9 +6073,9 @@
         </w:tc>
       </w:tr>
     </w:tbl>
-    <w:bookmarkEnd w:id="56"/>
-    <w:bookmarkEnd w:id="57"/>
-    <w:bookmarkStart w:id="63" w:name="จดการขอมลสนคาและจดสงซอเพม-uc-02"/>
+    <w:bookmarkEnd w:id="53"/>
+    <w:bookmarkEnd w:id="54"/>
+    <w:bookmarkStart w:id="60" w:name="จดการขอมลสนคาและจดสงซอเพม-uc-02"/>
     <w:p>
       <w:pPr>
         <w:pStyle w:val="Heading2"/>
@@ -6349,7 +6282,7 @@
         </w:tc>
       </w:tr>
     </w:tbl>
-    <w:bookmarkStart w:id="58" w:name="preconditions-1"/>
+    <w:bookmarkStart w:id="55" w:name="preconditions-1"/>
     <w:p>
       <w:pPr>
         <w:pStyle w:val="Heading3"/>
@@ -6370,8 +6303,8 @@
         <w:t xml:space="preserve">ผู้จัดการเข้าสู่ระบบสำเร็จตาม UC-01</w:t>
       </w:r>
     </w:p>
-    <w:bookmarkEnd w:id="58"/>
-    <w:bookmarkStart w:id="59" w:name="success-postconditions-1"/>
+    <w:bookmarkEnd w:id="55"/>
+    <w:bookmarkStart w:id="56" w:name="success-postconditions-1"/>
     <w:p>
       <w:pPr>
         <w:pStyle w:val="Heading3"/>
@@ -6416,8 +6349,8 @@
         <w:t xml:space="preserve">การปรับยอดคงเหลือทุกครั้งมีบันทึกการเคลื่อนไหวสต็อกพร้อมสาเหตุ</w:t>
       </w:r>
     </w:p>
-    <w:bookmarkEnd w:id="59"/>
-    <w:bookmarkStart w:id="60" w:name="main-success-scenario-1"/>
+    <w:bookmarkEnd w:id="56"/>
+    <w:bookmarkStart w:id="57" w:name="main-success-scenario-1"/>
     <w:p>
       <w:pPr>
         <w:pStyle w:val="Heading3"/>
@@ -6486,8 +6419,8 @@
         <w:t xml:space="preserve">ระบบตรวจว่าจุดสั่งซื้อเพิ่มที่ตั้งใหม่ทำให้สินค้ากลายเป็นต่ำกว่าเกณฑ์หรือไม่ แล้วสร้างการแจ้งเตือนถ้าจำเป็น</w:t>
       </w:r>
     </w:p>
-    <w:bookmarkEnd w:id="60"/>
-    <w:bookmarkStart w:id="61" w:name="alternate-flows-1"/>
+    <w:bookmarkEnd w:id="57"/>
+    <w:bookmarkStart w:id="58" w:name="alternate-flows-1"/>
     <w:p>
       <w:pPr>
         <w:pStyle w:val="Heading3"/>
@@ -6617,8 +6550,8 @@
         </w:tc>
       </w:tr>
     </w:tbl>
-    <w:bookmarkEnd w:id="61"/>
-    <w:bookmarkStart w:id="62" w:name="exception-flows-1"/>
+    <w:bookmarkEnd w:id="58"/>
+    <w:bookmarkStart w:id="59" w:name="exception-flows-1"/>
     <w:p>
       <w:pPr>
         <w:pStyle w:val="Heading3"/>
@@ -6893,9 +6826,9 @@
         </w:tc>
       </w:tr>
     </w:tbl>
-    <w:bookmarkEnd w:id="62"/>
-    <w:bookmarkEnd w:id="63"/>
-    <w:bookmarkStart w:id="69" w:name="X9741515b1cf33927aeb37a8663472abbf5640b6"/>
+    <w:bookmarkEnd w:id="59"/>
+    <w:bookmarkEnd w:id="60"/>
+    <w:bookmarkStart w:id="66" w:name="X9741515b1cf33927aeb37a8663472abbf5640b6"/>
     <w:p>
       <w:pPr>
         <w:pStyle w:val="Heading2"/>
@@ -7102,7 +7035,7 @@
         </w:tc>
       </w:tr>
     </w:tbl>
-    <w:bookmarkStart w:id="64" w:name="preconditions-2"/>
+    <w:bookmarkStart w:id="61" w:name="preconditions-2"/>
     <w:p>
       <w:pPr>
         <w:pStyle w:val="Heading3"/>
@@ -7135,8 +7068,8 @@
         <w:t xml:space="preserve">ระบบตั้งค่าหมายเลขพร้อมเพย์ของร้านไว้แล้ว</w:t>
       </w:r>
     </w:p>
-    <w:bookmarkEnd w:id="64"/>
-    <w:bookmarkStart w:id="65" w:name="success-postconditions-2"/>
+    <w:bookmarkEnd w:id="61"/>
+    <w:bookmarkStart w:id="62" w:name="success-postconditions-2"/>
     <w:p>
       <w:pPr>
         <w:pStyle w:val="Heading3"/>
@@ -7193,8 +7126,8 @@
         <w:t xml:space="preserve">มีบันทึกเหตุการณ์สร้างคำสั่งซื้อในประวัติการทำรายการ</w:t>
       </w:r>
     </w:p>
-    <w:bookmarkEnd w:id="65"/>
-    <w:bookmarkStart w:id="66" w:name="main-success-scenario-2"/>
+    <w:bookmarkEnd w:id="62"/>
+    <w:bookmarkStart w:id="63" w:name="main-success-scenario-2"/>
     <w:p>
       <w:pPr>
         <w:pStyle w:val="Heading3"/>
@@ -7287,8 +7220,8 @@
         <w:t xml:space="preserve">ระบบสั่งพิมพ์ใบเสร็จและผลักคำสั่งซื้อเข้าคิวคลังสินค้าแบบเรียลไทม์</w:t>
       </w:r>
     </w:p>
-    <w:bookmarkEnd w:id="66"/>
-    <w:bookmarkStart w:id="67" w:name="alternate-flows-2"/>
+    <w:bookmarkEnd w:id="63"/>
+    <w:bookmarkStart w:id="64" w:name="alternate-flows-2"/>
     <w:p>
       <w:pPr>
         <w:pStyle w:val="Heading3"/>
@@ -7453,8 +7386,8 @@
         </w:tc>
       </w:tr>
     </w:tbl>
-    <w:bookmarkEnd w:id="67"/>
-    <w:bookmarkStart w:id="68" w:name="exception-flows-2"/>
+    <w:bookmarkEnd w:id="64"/>
+    <w:bookmarkStart w:id="65" w:name="exception-flows-2"/>
     <w:p>
       <w:pPr>
         <w:pStyle w:val="Heading3"/>
@@ -7747,9 +7680,9 @@
         <w:t xml:space="preserve">ระบบเขียนคำสั่งซื้อลงฐานข้อมูลครั้งเดียวเมื่อรับชำระเงินแล้วเท่านั้น เนื่องจากแผนภาพสถานะกำหนดให้สถานะแรกของคำสั่งซื้อคือรอจ่ายสินค้า และคอลัมน์เวลารับชำระเงินห้ามเป็นค่าว่าง ผลพลอยได้คือฐานข้อมูลไม่มีคำสั่งซื้อค้างจากตะกร้าที่ลูกค้าเปลี่ยนใจ</w:t>
       </w:r>
     </w:p>
-    <w:bookmarkEnd w:id="68"/>
-    <w:bookmarkEnd w:id="69"/>
-    <w:bookmarkStart w:id="75" w:name="ควรอจายสนคาแบบเรยลไทม-uc-05-uc-06"/>
+    <w:bookmarkEnd w:id="65"/>
+    <w:bookmarkEnd w:id="66"/>
+    <w:bookmarkStart w:id="72" w:name="ควรอจายสนคาแบบเรยลไทม-uc-05-uc-06"/>
     <w:p>
       <w:pPr>
         <w:pStyle w:val="Heading2"/>
@@ -7956,7 +7889,7 @@
         </w:tc>
       </w:tr>
     </w:tbl>
-    <w:bookmarkStart w:id="70" w:name="preconditions-3"/>
+    <w:bookmarkStart w:id="67" w:name="preconditions-3"/>
     <w:p>
       <w:pPr>
         <w:pStyle w:val="Heading3"/>
@@ -7977,8 +7910,8 @@
         <w:t xml:space="preserve">พนักงานคลังสินค้าเข้าสู่ระบบและเปิดหน้าจอคิวค้างไว้</w:t>
       </w:r>
     </w:p>
-    <w:bookmarkEnd w:id="70"/>
-    <w:bookmarkStart w:id="71" w:name="success-postconditions-3"/>
+    <w:bookmarkEnd w:id="67"/>
+    <w:bookmarkStart w:id="68" w:name="success-postconditions-3"/>
     <w:p>
       <w:pPr>
         <w:pStyle w:val="Heading3"/>
@@ -8011,8 +7944,8 @@
         <w:t xml:space="preserve">สถานะการจัดของสะท้อนบนหน้าจอของพนักงานทุกคนที่เปิดหน้าเดียวกัน</w:t>
       </w:r>
     </w:p>
-    <w:bookmarkEnd w:id="71"/>
-    <w:bookmarkStart w:id="72" w:name="main-success-scenario-3"/>
+    <w:bookmarkEnd w:id="68"/>
+    <w:bookmarkStart w:id="69" w:name="main-success-scenario-3"/>
     <w:p>
       <w:pPr>
         <w:pStyle w:val="Heading3"/>
@@ -8069,8 +8002,8 @@
         <w:t xml:space="preserve">พนักงานกดเริ่มจัดของ ระบบเปลี่ยนสถานะเป็นกำลังจัดของและแจ้งไปยังหน้าจออื่น</w:t>
       </w:r>
     </w:p>
-    <w:bookmarkEnd w:id="72"/>
-    <w:bookmarkStart w:id="73" w:name="alternate-flows-3"/>
+    <w:bookmarkEnd w:id="69"/>
+    <w:bookmarkStart w:id="70" w:name="alternate-flows-3"/>
     <w:p>
       <w:pPr>
         <w:pStyle w:val="Heading3"/>
@@ -8235,8 +8168,8 @@
         </w:tc>
       </w:tr>
     </w:tbl>
-    <w:bookmarkEnd w:id="73"/>
-    <w:bookmarkStart w:id="74" w:name="exception-flows-3"/>
+    <w:bookmarkEnd w:id="70"/>
+    <w:bookmarkStart w:id="71" w:name="exception-flows-3"/>
     <w:p>
       <w:pPr>
         <w:pStyle w:val="Heading3"/>
@@ -8476,9 +8409,9 @@
         </w:tc>
       </w:tr>
     </w:tbl>
-    <w:bookmarkEnd w:id="74"/>
-    <w:bookmarkEnd w:id="75"/>
-    <w:bookmarkStart w:id="84" w:name="ยนยนจายสนคาและตดสตอก-uc-07"/>
+    <w:bookmarkEnd w:id="71"/>
+    <w:bookmarkEnd w:id="72"/>
+    <w:bookmarkStart w:id="78" w:name="ยนยนจายสนคาและตดสตอก-uc-07"/>
     <w:p>
       <w:pPr>
         <w:pStyle w:val="Heading2"/>
@@ -8493,73 +8426,6 @@
       </w:pPr>
       <w:r>
         <w:t xml:space="preserve">หัวข้อนี้เป็นความสามารถที่สำคัญที่สุดของระบบ และเป็นจุดที่ตอบวัตถุประสงค์ข้อ 1.2.3 โดยตรง</w:t>
-      </w:r>
-    </w:p>
-    <w:p>
-      <w:pPr>
-        <w:pStyle w:val="CaptionedFigure"/>
-      </w:pPr>
-      <w:r>
-        <w:drawing>
-          <wp:inline>
-            <wp:extent cx="5334000" cy="3669813"/>
-            <wp:effectExtent b="0" l="0" r="0" t="0"/>
-            <wp:docPr descr="แผนภาพลำดับของการยืนยันจ่ายสินค้า" title="" id="77" name="Picture"/>
-            <a:graphic>
-              <a:graphicData uri="http://schemas.openxmlformats.org/drawingml/2006/picture">
-                <pic:pic>
-                  <pic:nvPicPr>
-                    <pic:cNvPr descr="assets/diagrams/fig3-11_seq_uc07.png" id="78" name="Picture"/>
-                    <pic:cNvPicPr>
-                      <a:picLocks noChangeArrowheads="1" noChangeAspect="1"/>
-                    </pic:cNvPicPr>
-                  </pic:nvPicPr>
-                  <pic:blipFill>
-                    <a:blip r:embed="rId76"/>
-                    <a:stretch>
-                      <a:fillRect/>
-                    </a:stretch>
-                  </pic:blipFill>
-                  <pic:spPr bwMode="auto">
-                    <a:xfrm>
-                      <a:off x="0" y="0"/>
-                      <a:ext cx="5334000" cy="3669813"/>
-                    </a:xfrm>
-                    <a:prstGeom prst="rect">
-                      <a:avLst/>
-                    </a:prstGeom>
-                    <a:noFill/>
-                    <a:ln w="9525">
-                      <a:noFill/>
-                      <a:headEnd/>
-                      <a:tailEnd/>
-                    </a:ln>
-                  </pic:spPr>
-                </pic:pic>
-              </a:graphicData>
-            </a:graphic>
-          </wp:inline>
-        </w:drawing>
-      </w:r>
-    </w:p>
-    <w:p>
-      <w:pPr>
-        <w:pStyle w:val="ImageCaption"/>
-      </w:pPr>
-      <w:r>
-        <w:t xml:space="preserve">แผนภาพลำดับของการยืนยันจ่ายสินค้า</w:t>
-      </w:r>
-    </w:p>
-    <w:p>
-      <w:pPr>
-        <w:pStyle w:val="BodyText"/>
-      </w:pPr>
-      <w:r>
-        <w:rPr>
-          <w:i/>
-          <w:iCs/>
-        </w:rPr>
-        <w:t xml:space="preserve">ภาพที่ 7 — ลำดับการทำงานของการยืนยันจ่ายสินค้าและการตัดสต็อกภายในธุรกรรมเดียว</w:t>
       </w:r>
     </w:p>
     <w:tbl>
@@ -8761,7 +8627,7 @@
         </w:tc>
       </w:tr>
     </w:tbl>
-    <w:bookmarkStart w:id="79" w:name="preconditions-4"/>
+    <w:bookmarkStart w:id="73" w:name="preconditions-4"/>
     <w:p>
       <w:pPr>
         <w:pStyle w:val="Heading3"/>
@@ -8794,8 +8660,8 @@
         <w:t xml:space="preserve">พนักงานทำเครื่องหมายตรวจนับครบทุกรายการแล้ว</w:t>
       </w:r>
     </w:p>
-    <w:bookmarkEnd w:id="79"/>
-    <w:bookmarkStart w:id="80" w:name="success-postconditions-4"/>
+    <w:bookmarkEnd w:id="73"/>
+    <w:bookmarkStart w:id="74" w:name="success-postconditions-4"/>
     <w:p>
       <w:pPr>
         <w:pStyle w:val="Heading3"/>
@@ -8864,8 +8730,8 @@
         <w:t xml:space="preserve">มีบันทึกเหตุการณ์ยืนยันจ่ายในประวัติการทำรายการ</w:t>
       </w:r>
     </w:p>
-    <w:bookmarkEnd w:id="80"/>
-    <w:bookmarkStart w:id="81" w:name="main-success-scenario-4"/>
+    <w:bookmarkEnd w:id="74"/>
+    <w:bookmarkStart w:id="75" w:name="main-success-scenario-4"/>
     <w:p>
       <w:pPr>
         <w:pStyle w:val="Heading3"/>
@@ -8958,8 +8824,8 @@
         <w:t xml:space="preserve">หลังธุรกรรมสำเร็จ ระบบลบคำสั่งซื้อออกจากคิวทุกหน้าจอ และตรวจว่าสินค้าใดต่ำกว่าจุดสั่งซื้อเพิ่ม</w:t>
       </w:r>
     </w:p>
-    <w:bookmarkEnd w:id="81"/>
-    <w:bookmarkStart w:id="82" w:name="alternate-flows-4"/>
+    <w:bookmarkEnd w:id="75"/>
+    <w:bookmarkStart w:id="76" w:name="alternate-flows-4"/>
     <w:p>
       <w:pPr>
         <w:pStyle w:val="Heading3"/>
@@ -9089,8 +8955,8 @@
         </w:tc>
       </w:tr>
     </w:tbl>
-    <w:bookmarkEnd w:id="82"/>
-    <w:bookmarkStart w:id="83" w:name="exception-flows-4"/>
+    <w:bookmarkEnd w:id="76"/>
+    <w:bookmarkStart w:id="77" w:name="exception-flows-4"/>
     <w:p>
       <w:pPr>
         <w:pStyle w:val="Heading3"/>
@@ -9482,9 +9348,9 @@
         <w:t xml:space="preserve">ชั้นที่สอง การล็อกแถวสินค้าทำให้คำขอที่เข้ามาพร้อมกันต้องรอคิวกันตามลำดับ ไม่เกิดสภาวะแข่งขัน</w:t>
       </w:r>
     </w:p>
-    <w:bookmarkEnd w:id="83"/>
-    <w:bookmarkEnd w:id="84"/>
-    <w:bookmarkStart w:id="85" w:name="Xca924159c8d38813c87aaef27e6e21c1eea7ea0"/>
+    <w:bookmarkEnd w:id="77"/>
+    <w:bookmarkEnd w:id="78"/>
+    <w:bookmarkStart w:id="79" w:name="Xca924159c8d38813c87aaef27e6e21c1eea7ea0"/>
     <w:p>
       <w:pPr>
         <w:pStyle w:val="Heading2"/>
@@ -9948,8 +9814,8 @@
         <w:t xml:space="preserve">สถานะส่งมอบสำเร็จเกิดขึ้นได้ทางเดียวเท่านั้น คือผ่านธุรกรรมตัดสต็อกที่สำเร็จ ระบบต้องปฏิเสธการตั้งค่าสถานะนี้โดยตรงผ่านเส้นทางปรับสถานะทั่วไป เพราะถ้าอนุญาต สถานะจะไม่ใช่หลักฐานอีกต่อไปว่าสต็อกถูกหักแล้วจริง</w:t>
       </w:r>
     </w:p>
-    <w:bookmarkEnd w:id="85"/>
-    <w:bookmarkStart w:id="91" w:name="แดชบอรดปฏบตการและระดบบรหาร-uc-08-uc-09"/>
+    <w:bookmarkEnd w:id="79"/>
+    <w:bookmarkStart w:id="85" w:name="แดชบอรดปฏบตการและระดบบรหาร-uc-08-uc-09"/>
     <w:p>
       <w:pPr>
         <w:pStyle w:val="Heading2"/>
@@ -10156,7 +10022,7 @@
         </w:tc>
       </w:tr>
     </w:tbl>
-    <w:bookmarkStart w:id="86" w:name="preconditions-5"/>
+    <w:bookmarkStart w:id="80" w:name="preconditions-5"/>
     <w:p>
       <w:pPr>
         <w:pStyle w:val="Heading3"/>
@@ -10177,8 +10043,8 @@
         <w:t xml:space="preserve">ผู้ใช้เข้าสู่ระบบด้วยบทบาทที่มีสิทธิ์</w:t>
       </w:r>
     </w:p>
-    <w:bookmarkEnd w:id="86"/>
-    <w:bookmarkStart w:id="87" w:name="success-postconditions-5"/>
+    <w:bookmarkEnd w:id="80"/>
+    <w:bookmarkStart w:id="81" w:name="success-postconditions-5"/>
     <w:p>
       <w:pPr>
         <w:pStyle w:val="Heading3"/>
@@ -10199,8 +10065,8 @@
         <w:t xml:space="preserve">ตัวเลขที่แสดงตรงกับผลรวมที่คำนวณจากฐานข้อมูลในขณะนั้น</w:t>
       </w:r>
     </w:p>
-    <w:bookmarkEnd w:id="87"/>
-    <w:bookmarkStart w:id="88" w:name="main-success-scenario-5"/>
+    <w:bookmarkEnd w:id="81"/>
+    <w:bookmarkStart w:id="82" w:name="main-success-scenario-5"/>
     <w:p>
       <w:pPr>
         <w:pStyle w:val="Heading3"/>
@@ -10257,8 +10123,8 @@
         <w:t xml:space="preserve">แดชบอร์ดรีเฟรชตัวเองเมื่อได้รับเหตุการณ์จากระบบ</w:t>
       </w:r>
     </w:p>
-    <w:bookmarkEnd w:id="88"/>
-    <w:bookmarkStart w:id="89" w:name="alternate-flows-5"/>
+    <w:bookmarkEnd w:id="82"/>
+    <w:bookmarkStart w:id="83" w:name="alternate-flows-5"/>
     <w:p>
       <w:pPr>
         <w:pStyle w:val="Heading3"/>
@@ -10353,8 +10219,8 @@
         </w:tc>
       </w:tr>
     </w:tbl>
-    <w:bookmarkEnd w:id="89"/>
-    <w:bookmarkStart w:id="90" w:name="exception-flows-5"/>
+    <w:bookmarkEnd w:id="83"/>
+    <w:bookmarkStart w:id="84" w:name="exception-flows-5"/>
     <w:p>
       <w:pPr>
         <w:pStyle w:val="Heading3"/>
@@ -10594,9 +10460,9 @@
         </w:tc>
       </w:tr>
     </w:tbl>
-    <w:bookmarkEnd w:id="90"/>
-    <w:bookmarkEnd w:id="91"/>
-    <w:bookmarkStart w:id="97" w:name="การแจงเตอนภายในแอปพลเคชน-uc-11"/>
+    <w:bookmarkEnd w:id="84"/>
+    <w:bookmarkEnd w:id="85"/>
+    <w:bookmarkStart w:id="91" w:name="การแจงเตอนภายในแอปพลเคชน-uc-11"/>
     <w:p>
       <w:pPr>
         <w:pStyle w:val="Heading2"/>
@@ -10803,7 +10669,7 @@
         </w:tc>
       </w:tr>
     </w:tbl>
-    <w:bookmarkStart w:id="92" w:name="preconditions-6"/>
+    <w:bookmarkStart w:id="86" w:name="preconditions-6"/>
     <w:p>
       <w:pPr>
         <w:pStyle w:val="Heading3"/>
@@ -10824,8 +10690,8 @@
         <w:t xml:space="preserve">มีการตั้งจุดสั่งซื้อเพิ่มของสินค้า และตั้งเกณฑ์เวลาคิวค้างไว้แล้ว</w:t>
       </w:r>
     </w:p>
-    <w:bookmarkEnd w:id="92"/>
-    <w:bookmarkStart w:id="93" w:name="success-postconditions-6"/>
+    <w:bookmarkEnd w:id="86"/>
+    <w:bookmarkStart w:id="87" w:name="success-postconditions-6"/>
     <w:p>
       <w:pPr>
         <w:pStyle w:val="Heading3"/>
@@ -10858,8 +10724,8 @@
         <w:t xml:space="preserve">การแจ้งเตือนถูกส่งไปแสดงบนหน้าจอที่เปิดค้างอยู่ทันที</w:t>
       </w:r>
     </w:p>
-    <w:bookmarkEnd w:id="93"/>
-    <w:bookmarkStart w:id="94" w:name="main-success-scenario-6"/>
+    <w:bookmarkEnd w:id="87"/>
+    <w:bookmarkStart w:id="88" w:name="main-success-scenario-6"/>
     <w:p>
       <w:pPr>
         <w:pStyle w:val="Heading3"/>
@@ -10916,8 +10782,8 @@
         <w:t xml:space="preserve">ผู้จัดการทำเครื่องหมายว่าอ่านแล้วเมื่อรับทราบ</w:t>
       </w:r>
     </w:p>
-    <w:bookmarkEnd w:id="94"/>
-    <w:bookmarkStart w:id="95" w:name="alternate-flows-6"/>
+    <w:bookmarkEnd w:id="88"/>
+    <w:bookmarkStart w:id="89" w:name="alternate-flows-6"/>
     <w:p>
       <w:pPr>
         <w:pStyle w:val="Heading3"/>
@@ -11047,8 +10913,8 @@
         </w:tc>
       </w:tr>
     </w:tbl>
-    <w:bookmarkEnd w:id="95"/>
-    <w:bookmarkStart w:id="96" w:name="exception-flows-6"/>
+    <w:bookmarkEnd w:id="89"/>
+    <w:bookmarkStart w:id="90" w:name="exception-flows-6"/>
     <w:p>
       <w:pPr>
         <w:pStyle w:val="Heading3"/>
@@ -11253,9 +11119,9 @@
         </w:tc>
       </w:tr>
     </w:tbl>
-    <w:bookmarkEnd w:id="96"/>
-    <w:bookmarkEnd w:id="97"/>
-    <w:bookmarkStart w:id="103" w:name="ประวตการทำรายการ-uc-10"/>
+    <w:bookmarkEnd w:id="90"/>
+    <w:bookmarkEnd w:id="91"/>
+    <w:bookmarkStart w:id="97" w:name="ประวตการทำรายการ-uc-10"/>
     <w:p>
       <w:pPr>
         <w:pStyle w:val="Heading2"/>
@@ -11461,7 +11327,7 @@
         </w:tc>
       </w:tr>
     </w:tbl>
-    <w:bookmarkStart w:id="98" w:name="preconditions-7"/>
+    <w:bookmarkStart w:id="92" w:name="preconditions-7"/>
     <w:p>
       <w:pPr>
         <w:pStyle w:val="Heading3"/>
@@ -11482,8 +11348,8 @@
         <w:t xml:space="preserve">ผู้จัดการเข้าสู่ระบบสำเร็จ</w:t>
       </w:r>
     </w:p>
-    <w:bookmarkEnd w:id="98"/>
-    <w:bookmarkStart w:id="99" w:name="success-postconditions-7"/>
+    <w:bookmarkEnd w:id="92"/>
+    <w:bookmarkStart w:id="93" w:name="success-postconditions-7"/>
     <w:p>
       <w:pPr>
         <w:pStyle w:val="Heading3"/>
@@ -11504,8 +11370,8 @@
         <w:t xml:space="preserve">ผลลัพธ์ตรงตามเงื่อนไขที่กรองทุกแถว</w:t>
       </w:r>
     </w:p>
-    <w:bookmarkEnd w:id="99"/>
-    <w:bookmarkStart w:id="100" w:name="main-success-scenario-7"/>
+    <w:bookmarkEnd w:id="93"/>
+    <w:bookmarkStart w:id="94" w:name="main-success-scenario-7"/>
     <w:p>
       <w:pPr>
         <w:pStyle w:val="Heading3"/>
@@ -11550,8 +11416,8 @@
         <w:t xml:space="preserve">ระบบแสดงผลพร้อมชื่อผู้กระทำ เวลา ข้อมูลที่ถูกกระทำ รายละเอียดการเปลี่ยนแปลง และหมายเลขไอพี</w:t>
       </w:r>
     </w:p>
-    <w:bookmarkEnd w:id="100"/>
-    <w:bookmarkStart w:id="101" w:name="alternate-flows-7"/>
+    <w:bookmarkEnd w:id="94"/>
+    <w:bookmarkStart w:id="95" w:name="alternate-flows-7"/>
     <w:p>
       <w:pPr>
         <w:pStyle w:val="Heading3"/>
@@ -11646,8 +11512,8 @@
         </w:tc>
       </w:tr>
     </w:tbl>
-    <w:bookmarkEnd w:id="101"/>
-    <w:bookmarkStart w:id="102" w:name="exception-flows-7"/>
+    <w:bookmarkEnd w:id="95"/>
+    <w:bookmarkStart w:id="96" w:name="exception-flows-7"/>
     <w:p>
       <w:pPr>
         <w:pStyle w:val="Heading3"/>
@@ -11851,9 +11717,9 @@
         </w:tc>
       </w:tr>
     </w:tbl>
-    <w:bookmarkEnd w:id="102"/>
-    <w:bookmarkEnd w:id="103"/>
-    <w:bookmarkStart w:id="104" w:name="ความสามารถทเกบไวนอกขอบเขตของรนน"/>
+    <w:bookmarkEnd w:id="96"/>
+    <w:bookmarkEnd w:id="97"/>
+    <w:bookmarkStart w:id="98" w:name="ความสามารถทเกบไวนอกขอบเขตของรนน"/>
     <w:p>
       <w:pPr>
         <w:pStyle w:val="Heading2"/>
@@ -12085,9 +11951,9 @@
         </w:pict>
       </w:r>
     </w:p>
-    <w:bookmarkEnd w:id="104"/>
-    <w:bookmarkEnd w:id="105"/>
-    <w:bookmarkStart w:id="111" w:name="other-nonfunctional-requirements"/>
+    <w:bookmarkEnd w:id="98"/>
+    <w:bookmarkEnd w:id="99"/>
+    <w:bookmarkStart w:id="105" w:name="other-nonfunctional-requirements"/>
     <w:p>
       <w:pPr>
         <w:pStyle w:val="Heading1"/>
@@ -12096,7 +11962,7 @@
         <w:t xml:space="preserve">5. Other Nonfunctional Requirements</w:t>
       </w:r>
     </w:p>
-    <w:bookmarkStart w:id="106" w:name="performance-requirements"/>
+    <w:bookmarkStart w:id="100" w:name="performance-requirements"/>
     <w:p>
       <w:pPr>
         <w:pStyle w:val="Heading2"/>
@@ -12314,8 +12180,8 @@
         <w:t xml:space="preserve">ตัวเลขทั้งหมดวัดในสภาพแวดล้อมที่ทุกส่วนของระบบทำงานบนเครื่องเดียวกัน ไม่มีความหน่วงจากเครือข่าย เมื่อติดตั้งใช้งานจริงค่าที่วัดได้จะสูงกว่านี้ตามคุณภาพของเครือข่าย แต่ช่องว่างจากเกณฑ์ยังมากพอสมควร</w:t>
       </w:r>
     </w:p>
-    <w:bookmarkEnd w:id="106"/>
-    <w:bookmarkStart w:id="107" w:name="safety-requirements"/>
+    <w:bookmarkEnd w:id="100"/>
+    <w:bookmarkStart w:id="101" w:name="safety-requirements"/>
     <w:p>
       <w:pPr>
         <w:pStyle w:val="Heading2"/>
@@ -12467,8 +12333,8 @@
         </w:tc>
       </w:tr>
     </w:tbl>
-    <w:bookmarkEnd w:id="107"/>
-    <w:bookmarkStart w:id="108" w:name="security-requirements"/>
+    <w:bookmarkEnd w:id="101"/>
+    <w:bookmarkStart w:id="102" w:name="security-requirements"/>
     <w:p>
       <w:pPr>
         <w:pStyle w:val="Heading2"/>
@@ -12778,8 +12644,8 @@
         </w:tc>
       </w:tr>
     </w:tbl>
-    <w:bookmarkEnd w:id="108"/>
-    <w:bookmarkStart w:id="109" w:name="software-quality-attributes"/>
+    <w:bookmarkEnd w:id="102"/>
+    <w:bookmarkStart w:id="103" w:name="software-quality-attributes"/>
     <w:p>
       <w:pPr>
         <w:pStyle w:val="Heading2"/>
@@ -13089,8 +12955,8 @@
         <w:t xml:space="preserve">ความครอบคลุมโค้ดของชุดทดสอบอยู่ที่ร้อยละ 83.73 ของคำสั่ง และร้อยละ 86.49 ของบรรทัด สูงกว่าเกณฑ์ร้อยละ 70 ที่กำหนดไว้</w:t>
       </w:r>
     </w:p>
-    <w:bookmarkEnd w:id="109"/>
-    <w:bookmarkStart w:id="110" w:name="business-rules"/>
+    <w:bookmarkEnd w:id="103"/>
+    <w:bookmarkStart w:id="104" w:name="business-rules"/>
     <w:p>
       <w:pPr>
         <w:pStyle w:val="Heading2"/>
@@ -13479,9 +13345,9 @@
         </w:pict>
       </w:r>
     </w:p>
-    <w:bookmarkEnd w:id="110"/>
-    <w:bookmarkEnd w:id="111"/>
-    <w:bookmarkStart w:id="115" w:name="other-requirements"/>
+    <w:bookmarkEnd w:id="104"/>
+    <w:bookmarkEnd w:id="105"/>
+    <w:bookmarkStart w:id="109" w:name="other-requirements"/>
     <w:p>
       <w:pPr>
         <w:pStyle w:val="Heading1"/>
@@ -13490,7 +13356,7 @@
         <w:t xml:space="preserve">6. Other Requirements</w:t>
       </w:r>
     </w:p>
-    <w:bookmarkStart w:id="112" w:name="data-and-audit-requirements"/>
+    <w:bookmarkStart w:id="106" w:name="data-and-audit-requirements"/>
     <w:p>
       <w:pPr>
         <w:pStyle w:val="Heading2"/>
@@ -13658,8 +13524,8 @@
         </w:tc>
       </w:tr>
     </w:tbl>
-    <w:bookmarkEnd w:id="112"/>
-    <w:bookmarkStart w:id="113" w:name="language-and-terminology"/>
+    <w:bookmarkEnd w:id="106"/>
+    <w:bookmarkStart w:id="107" w:name="language-and-terminology"/>
     <w:p>
       <w:pPr>
         <w:pStyle w:val="Heading2"/>
@@ -13676,8 +13542,8 @@
         <w:t xml:space="preserve">ส่วนต่อประสานผู้ใช้ ข้อความแจ้งเตือน และใบเสร็จใช้ภาษาไทยทั้งหมด จำนวนเงินแสดงในรูปแบบสกุลเงินบาทพร้อมทศนิยมสองตำแหน่ง วันที่บนใบเสร็จแสดงตามปฏิทินไทย ข้อความบนใบเสร็จส่งไปยังเครื่องพิมพ์ด้วยรหัส TIS-620 และหลีกเลี่ยงอักขระที่อยู่นอกชุดรหัสนั้น</w:t>
       </w:r>
     </w:p>
-    <w:bookmarkEnd w:id="113"/>
-    <w:bookmarkStart w:id="114" w:name="release-and-change-boundary"/>
+    <w:bookmarkEnd w:id="107"/>
+    <w:bookmarkStart w:id="108" w:name="release-and-change-boundary"/>
     <w:p>
       <w:pPr>
         <w:pStyle w:val="Heading2"/>
@@ -13828,9 +13694,9 @@
         </w:pict>
       </w:r>
     </w:p>
-    <w:bookmarkEnd w:id="114"/>
-    <w:bookmarkEnd w:id="115"/>
-    <w:bookmarkStart w:id="116" w:name="appendix-a-glossary"/>
+    <w:bookmarkEnd w:id="108"/>
+    <w:bookmarkEnd w:id="109"/>
+    <w:bookmarkStart w:id="110" w:name="appendix-a-glossary"/>
     <w:p>
       <w:pPr>
         <w:pStyle w:val="Heading1"/>
@@ -14245,8 +14111,8 @@
         </w:pict>
       </w:r>
     </w:p>
-    <w:bookmarkEnd w:id="116"/>
-    <w:bookmarkStart w:id="128" w:name="appendix-b-analysis-models"/>
+    <w:bookmarkEnd w:id="110"/>
+    <w:bookmarkStart w:id="122" w:name="appendix-b-analysis-models"/>
     <w:p>
       <w:pPr>
         <w:pStyle w:val="Heading1"/>
@@ -14255,7 +14121,7 @@
         <w:t xml:space="preserve">Appendix B: Analysis Models</w:t>
       </w:r>
     </w:p>
-    <w:bookmarkStart w:id="120" w:name="b.1-แบบจำลองวงจรชวตของคำสงซอ"/>
+    <w:bookmarkStart w:id="114" w:name="b.1-แบบจำลองวงจรชวตของคำสงซอ"/>
     <w:p>
       <w:pPr>
         <w:pStyle w:val="Heading2"/>
@@ -14273,18 +14139,18 @@
           <wp:inline>
             <wp:extent cx="5334000" cy="4759765"/>
             <wp:effectExtent b="0" l="0" r="0" t="0"/>
-            <wp:docPr descr="แผนภาพสถานะของคำสั่งซื้อ" title="" id="118" name="Picture"/>
+            <wp:docPr descr="แผนภาพสถานะของคำสั่งซื้อ" title="" id="112" name="Picture"/>
             <a:graphic>
               <a:graphicData uri="http://schemas.openxmlformats.org/drawingml/2006/picture">
                 <pic:pic>
                   <pic:nvPicPr>
-                    <pic:cNvPr descr="assets/diagrams/fig3-13_state_order.png" id="119" name="Picture"/>
+                    <pic:cNvPr descr="assets/diagrams/fig3-13_state_order.png" id="113" name="Picture"/>
                     <pic:cNvPicPr>
                       <a:picLocks noChangeArrowheads="1" noChangeAspect="1"/>
                     </pic:cNvPicPr>
                   </pic:nvPicPr>
                   <pic:blipFill>
-                    <a:blip r:embed="rId117"/>
+                    <a:blip r:embed="rId111"/>
                     <a:stretch>
                       <a:fillRect/>
                     </a:stretch>
@@ -14328,7 +14194,7 @@
           <w:i/>
           <w:iCs/>
         </w:rPr>
-        <w:t xml:space="preserve">ภาพที่ 8 — Order Lifecycle Model แสดงสถานะทั้งสี่และเส้นทางการเปลี่ยนสถานะที่ระบบอนุญาต</w:t>
+        <w:t xml:space="preserve">ภาพที่ 6 — Order Lifecycle Model แสดงสถานะทั้งสี่และเส้นทางการเปลี่ยนสถานะที่ระบบอนุญาต</w:t>
       </w:r>
     </w:p>
     <w:p>
@@ -14339,8 +14205,8 @@
         <w:t xml:space="preserve">แบบจำลองนี้เป็นหัวใจของระบบ เพราะสถานะของคำสั่งซื้อทำหน้าที่สองอย่างพร้อมกัน คือบอกว่างานอยู่ขั้นใด และเป็นกลไกล็อกที่ทำให้การจ่ายสินค้าเกิดขึ้นได้เพียงครั้งเดียว</w:t>
       </w:r>
     </w:p>
-    <w:bookmarkEnd w:id="120"/>
-    <w:bookmarkStart w:id="124" w:name="b.2-conceptual-domain-model"/>
+    <w:bookmarkEnd w:id="114"/>
+    <w:bookmarkStart w:id="118" w:name="b.2-conceptual-domain-model"/>
     <w:p>
       <w:pPr>
         <w:pStyle w:val="Heading2"/>
@@ -14358,18 +14224,18 @@
           <wp:inline>
             <wp:extent cx="5334000" cy="4208245"/>
             <wp:effectExtent b="0" l="0" r="0" t="0"/>
-            <wp:docPr descr="แผนภาพความสัมพันธ์ระหว่างข้อมูล" title="" id="122" name="Picture"/>
+            <wp:docPr descr="แผนภาพความสัมพันธ์ระหว่างข้อมูล" title="" id="116" name="Picture"/>
             <a:graphic>
               <a:graphicData uri="http://schemas.openxmlformats.org/drawingml/2006/picture">
                 <pic:pic>
                   <pic:nvPicPr>
-                    <pic:cNvPr descr="assets/diagrams/fig3-05_erd.png" id="123" name="Picture"/>
+                    <pic:cNvPr descr="assets/diagrams/fig3-05_erd.png" id="117" name="Picture"/>
                     <pic:cNvPicPr>
                       <a:picLocks noChangeArrowheads="1" noChangeAspect="1"/>
                     </pic:cNvPicPr>
                   </pic:nvPicPr>
                   <pic:blipFill>
-                    <a:blip r:embed="rId121"/>
+                    <a:blip r:embed="rId115"/>
                     <a:stretch>
                       <a:fillRect/>
                     </a:stretch>
@@ -14413,7 +14279,7 @@
           <w:i/>
           <w:iCs/>
         </w:rPr>
-        <w:t xml:space="preserve">ภาพที่ 9 — โครงสร้างเชิงตรรกะของผู้ใช้งาน สินค้า คำสั่งซื้อ รายการสินค้า การเคลื่อนไหวสต็อก การแจ้งเตือน และประวัติการทำรายการ</w:t>
+        <w:t xml:space="preserve">ภาพที่ 7 — โครงสร้างเชิงตรรกะของผู้ใช้งาน สินค้า คำสั่งซื้อ รายการสินค้า การเคลื่อนไหวสต็อก การแจ้งเตือน และประวัติการทำรายการ</w:t>
       </w:r>
     </w:p>
     <w:p>
@@ -14424,8 +14290,8 @@
         <w:t xml:space="preserve">แผนภาพนี้แสดงความสัมพันธ์เชิงตรรกะระหว่างข้อมูล มิใช่ข้อกำหนดของโครงสร้างตารางในฐานข้อมูล ประเด็นที่ต้องสังเกตคือรายการสินค้าในคำสั่งซื้อเก็บราคาต่อหน่วย ณ เวลาที่ขายไว้แยกจากราคาปัจจุบันของสินค้า เพื่อให้ใบเสร็จย้อนหลังยังถูกต้องแม้ราคาจะเปลี่ยนไปแล้ว</w:t>
       </w:r>
     </w:p>
-    <w:bookmarkEnd w:id="124"/>
-    <w:bookmarkStart w:id="125" w:name="b.3-model-elements-and-traceability"/>
+    <w:bookmarkEnd w:id="118"/>
+    <w:bookmarkStart w:id="119" w:name="b.3-model-elements-and-traceability"/>
     <w:p>
       <w:pPr>
         <w:pStyle w:val="Heading2"/>
@@ -14965,8 +14831,8 @@
         </w:tc>
       </w:tr>
     </w:tbl>
-    <w:bookmarkEnd w:id="125"/>
-    <w:bookmarkStart w:id="126" w:name="b.4-state-semantics"/>
+    <w:bookmarkEnd w:id="119"/>
+    <w:bookmarkStart w:id="120" w:name="b.4-state-semantics"/>
     <w:p>
       <w:pPr>
         <w:pStyle w:val="Heading2"/>
@@ -15236,8 +15102,8 @@
         </w:tc>
       </w:tr>
     </w:tbl>
-    <w:bookmarkEnd w:id="126"/>
-    <w:bookmarkStart w:id="127" w:name="b.5-authority-matrix"/>
+    <w:bookmarkEnd w:id="120"/>
+    <w:bookmarkStart w:id="121" w:name="b.5-authority-matrix"/>
     <w:p>
       <w:pPr>
         <w:pStyle w:val="Heading2"/>
@@ -15452,9 +15318,9 @@
         </w:pict>
       </w:r>
     </w:p>
-    <w:bookmarkEnd w:id="127"/>
-    <w:bookmarkEnd w:id="128"/>
-    <w:bookmarkStart w:id="129" w:name="appendix-c-to-be-determined-list"/>
+    <w:bookmarkEnd w:id="121"/>
+    <w:bookmarkEnd w:id="122"/>
+    <w:bookmarkStart w:id="123" w:name="appendix-c-to-be-determined-list"/>
     <w:p>
       <w:pPr>
         <w:pStyle w:val="Heading1"/>
@@ -15809,8 +15675,8 @@
         </w:pict>
       </w:r>
     </w:p>
-    <w:bookmarkEnd w:id="129"/>
-    <w:bookmarkStart w:id="131" w:name="appendix-d-acceptance-criteria"/>
+    <w:bookmarkEnd w:id="123"/>
+    <w:bookmarkStart w:id="125" w:name="appendix-d-acceptance-criteria"/>
     <w:p>
       <w:pPr>
         <w:pStyle w:val="Heading1"/>
@@ -16749,7 +16615,7 @@
         </w:tc>
       </w:tr>
     </w:tbl>
-    <w:bookmarkStart w:id="130" w:name="negative-boundary-scenarios"/>
+    <w:bookmarkStart w:id="124" w:name="negative-boundary-scenarios"/>
     <w:p>
       <w:pPr>
         <w:pStyle w:val="Heading2"/>
@@ -16972,9 +16838,9 @@
         </w:pict>
       </w:r>
     </w:p>
-    <w:bookmarkEnd w:id="130"/>
-    <w:bookmarkEnd w:id="131"/>
-    <w:bookmarkStart w:id="136" w:name="appendix-e-end-to-end-traceability"/>
+    <w:bookmarkEnd w:id="124"/>
+    <w:bookmarkEnd w:id="125"/>
+    <w:bookmarkStart w:id="129" w:name="appendix-e-end-to-end-traceability"/>
     <w:p>
       <w:pPr>
         <w:pStyle w:val="Heading1"/>
@@ -16983,7 +16849,7 @@
         <w:t xml:space="preserve">Appendix E: End-to-End Traceability</w:t>
       </w:r>
     </w:p>
-    <w:bookmarkStart w:id="132" w:name="e.1-evidence-requirement-use-case-test"/>
+    <w:bookmarkStart w:id="126" w:name="e.1-evidence-requirement-use-case-test"/>
     <w:p>
       <w:pPr>
         <w:pStyle w:val="Heading2"/>
@@ -17580,8 +17446,8 @@
         </w:tc>
       </w:tr>
     </w:tbl>
-    <w:bookmarkEnd w:id="132"/>
-    <w:bookmarkStart w:id="133" w:name="Xbdc25beaada25c12294dff12f09bf3592f83822"/>
+    <w:bookmarkEnd w:id="126"/>
+    <w:bookmarkStart w:id="127" w:name="Xbdc25beaada25c12294dff12f09bf3592f83822"/>
     <w:p>
       <w:pPr>
         <w:pStyle w:val="Heading2"/>
@@ -18007,8 +17873,8 @@
         </w:tc>
       </w:tr>
     </w:tbl>
-    <w:bookmarkEnd w:id="133"/>
-    <w:bookmarkStart w:id="134" w:name="e.3-end-to-end-example"/>
+    <w:bookmarkEnd w:id="127"/>
+    <w:bookmarkStart w:id="128" w:name="e.3-end-to-end-example"/>
     <w:p>
       <w:pPr>
         <w:pStyle w:val="Heading2"/>
@@ -18356,1117 +18222,6 @@
         </w:tc>
       </w:tr>
     </w:tbl>
-    <w:bookmarkEnd w:id="134"/>
-    <w:bookmarkStart w:id="135" w:name="e.4-requirement-verification-result"/>
-    <w:p>
-      <w:pPr>
-        <w:pStyle w:val="Heading2"/>
-      </w:pPr>
-      <w:r>
-        <w:t xml:space="preserve">E.4 Requirement → Verification Result</w:t>
-      </w:r>
-    </w:p>
-    <w:tbl>
-      <w:tblPr>
-        <w:tblStyle w:val="Table"/>
-        <w:tblW w:type="pct" w:w="5000"/>
-        <w:tblLayout w:type="fixed"/>
-        <w:tblLook w:firstRow="1" w:lastRow="0" w:firstColumn="0" w:lastColumn="0" w:noHBand="0" w:noVBand="0" w:val="0020"/>
-      </w:tblPr>
-      <w:tblGrid>
-        <w:gridCol w:w="1584"/>
-        <w:gridCol w:w="1584"/>
-        <w:gridCol w:w="1584"/>
-        <w:gridCol w:w="1584"/>
-        <w:gridCol w:w="1584"/>
-      </w:tblGrid>
-      <w:tr>
-        <w:trPr>
-          <w:tblHeader w:val="on"/>
-        </w:trPr>
-        <w:tc>
-          <w:tcPr/>
-          <w:p>
-            <w:pPr>
-              <w:pStyle w:val="Compact"/>
-            </w:pPr>
-            <w:r>
-              <w:t xml:space="preserve">ID</w:t>
-            </w:r>
-          </w:p>
-        </w:tc>
-        <w:tc>
-          <w:tcPr/>
-          <w:p>
-            <w:pPr>
-              <w:pStyle w:val="Compact"/>
-            </w:pPr>
-            <w:r>
-              <w:t xml:space="preserve">ความต้องการ</w:t>
-            </w:r>
-          </w:p>
-        </w:tc>
-        <w:tc>
-          <w:tcPr/>
-          <w:p>
-            <w:pPr>
-              <w:pStyle w:val="Compact"/>
-            </w:pPr>
-            <w:r>
-              <w:t xml:space="preserve">Use Case</w:t>
-            </w:r>
-          </w:p>
-        </w:tc>
-        <w:tc>
-          <w:tcPr/>
-          <w:p>
-            <w:pPr>
-              <w:pStyle w:val="Compact"/>
-            </w:pPr>
-            <w:r>
-              <w:t xml:space="preserve">Test Case</w:t>
-            </w:r>
-          </w:p>
-        </w:tc>
-        <w:tc>
-          <w:tcPr/>
-          <w:p>
-            <w:pPr>
-              <w:pStyle w:val="Compact"/>
-            </w:pPr>
-            <w:r>
-              <w:t xml:space="preserve">ผลการทดสอบ</w:t>
-            </w:r>
-          </w:p>
-        </w:tc>
-      </w:tr>
-      <w:tr>
-        <w:tc>
-          <w:tcPr/>
-          <w:p>
-            <w:pPr>
-              <w:pStyle w:val="Compact"/>
-            </w:pPr>
-            <w:r>
-              <w:t xml:space="preserve">FR-01</w:t>
-            </w:r>
-          </w:p>
-        </w:tc>
-        <w:tc>
-          <w:tcPr/>
-          <w:p>
-            <w:pPr>
-              <w:pStyle w:val="Compact"/>
-            </w:pPr>
-            <w:r>
-              <w:t xml:space="preserve">เข้าสู่ระบบและควบคุมสิทธิ์ตามบทบาท</w:t>
-            </w:r>
-          </w:p>
-        </w:tc>
-        <w:tc>
-          <w:tcPr/>
-          <w:p>
-            <w:pPr>
-              <w:pStyle w:val="Compact"/>
-            </w:pPr>
-            <w:r>
-              <w:t xml:space="preserve">UC-01</w:t>
-            </w:r>
-          </w:p>
-        </w:tc>
-        <w:tc>
-          <w:tcPr/>
-          <w:p>
-            <w:pPr>
-              <w:pStyle w:val="Compact"/>
-            </w:pPr>
-            <w:r>
-              <w:t xml:space="preserve">TC-01</w:t>
-            </w:r>
-          </w:p>
-        </w:tc>
-        <w:tc>
-          <w:tcPr/>
-          <w:p>
-            <w:pPr>
-              <w:pStyle w:val="Compact"/>
-            </w:pPr>
-            <w:r>
-              <w:t xml:space="preserve">ผ่าน</w:t>
-            </w:r>
-          </w:p>
-        </w:tc>
-      </w:tr>
-      <w:tr>
-        <w:tc>
-          <w:tcPr/>
-          <w:p>
-            <w:pPr>
-              <w:pStyle w:val="Compact"/>
-            </w:pPr>
-            <w:r>
-              <w:t xml:space="preserve">FR-02</w:t>
-            </w:r>
-          </w:p>
-        </w:tc>
-        <w:tc>
-          <w:tcPr/>
-          <w:p>
-            <w:pPr>
-              <w:pStyle w:val="Compact"/>
-            </w:pPr>
-            <w:r>
-              <w:t xml:space="preserve">จัดการข้อมูลสินค้าและจุดสั่งซื้อเพิ่ม</w:t>
-            </w:r>
-          </w:p>
-        </w:tc>
-        <w:tc>
-          <w:tcPr/>
-          <w:p>
-            <w:pPr>
-              <w:pStyle w:val="Compact"/>
-            </w:pPr>
-            <w:r>
-              <w:t xml:space="preserve">UC-02</w:t>
-            </w:r>
-          </w:p>
-        </w:tc>
-        <w:tc>
-          <w:tcPr/>
-          <w:p>
-            <w:pPr>
-              <w:pStyle w:val="Compact"/>
-            </w:pPr>
-            <w:r>
-              <w:t xml:space="preserve">TC-02</w:t>
-            </w:r>
-          </w:p>
-        </w:tc>
-        <w:tc>
-          <w:tcPr/>
-          <w:p>
-            <w:pPr>
-              <w:pStyle w:val="Compact"/>
-            </w:pPr>
-            <w:r>
-              <w:t xml:space="preserve">ผ่าน</w:t>
-            </w:r>
-          </w:p>
-        </w:tc>
-      </w:tr>
-      <w:tr>
-        <w:tc>
-          <w:tcPr/>
-          <w:p>
-            <w:pPr>
-              <w:pStyle w:val="Compact"/>
-            </w:pPr>
-            <w:r>
-              <w:t xml:space="preserve">FR-03</w:t>
-            </w:r>
-          </w:p>
-        </w:tc>
-        <w:tc>
-          <w:tcPr/>
-          <w:p>
-            <w:pPr>
-              <w:pStyle w:val="Compact"/>
-            </w:pPr>
-            <w:r>
-              <w:t xml:space="preserve">สร้างคำสั่งซื้อ รับชำระ และออกใบเสร็จ</w:t>
-            </w:r>
-          </w:p>
-        </w:tc>
-        <w:tc>
-          <w:tcPr/>
-          <w:p>
-            <w:pPr>
-              <w:pStyle w:val="Compact"/>
-            </w:pPr>
-            <w:r>
-              <w:t xml:space="preserve">UC-03, UC-04</w:t>
-            </w:r>
-          </w:p>
-        </w:tc>
-        <w:tc>
-          <w:tcPr/>
-          <w:p>
-            <w:pPr>
-              <w:pStyle w:val="Compact"/>
-            </w:pPr>
-            <w:r>
-              <w:t xml:space="preserve">TC-03, TC-04, TC-13</w:t>
-            </w:r>
-          </w:p>
-        </w:tc>
-        <w:tc>
-          <w:tcPr/>
-          <w:p>
-            <w:pPr>
-              <w:pStyle w:val="Compact"/>
-            </w:pPr>
-            <w:r>
-              <w:t xml:space="preserve">ผ่าน</w:t>
-            </w:r>
-          </w:p>
-        </w:tc>
-      </w:tr>
-      <w:tr>
-        <w:tc>
-          <w:tcPr/>
-          <w:p>
-            <w:pPr>
-              <w:pStyle w:val="Compact"/>
-            </w:pPr>
-            <w:r>
-              <w:t xml:space="preserve">FR-04</w:t>
-            </w:r>
-          </w:p>
-        </w:tc>
-        <w:tc>
-          <w:tcPr/>
-          <w:p>
-            <w:pPr>
-              <w:pStyle w:val="Compact"/>
-            </w:pPr>
-            <w:r>
-              <w:t xml:space="preserve">คิวรอจ่ายสินค้าแบบเรียลไทม์</w:t>
-            </w:r>
-          </w:p>
-        </w:tc>
-        <w:tc>
-          <w:tcPr/>
-          <w:p>
-            <w:pPr>
-              <w:pStyle w:val="Compact"/>
-            </w:pPr>
-            <w:r>
-              <w:t xml:space="preserve">UC-05, UC-06</w:t>
-            </w:r>
-          </w:p>
-        </w:tc>
-        <w:tc>
-          <w:tcPr/>
-          <w:p>
-            <w:pPr>
-              <w:pStyle w:val="Compact"/>
-            </w:pPr>
-            <w:r>
-              <w:t xml:space="preserve">TC-05</w:t>
-            </w:r>
-          </w:p>
-        </w:tc>
-        <w:tc>
-          <w:tcPr/>
-          <w:p>
-            <w:pPr>
-              <w:pStyle w:val="Compact"/>
-            </w:pPr>
-            <w:r>
-              <w:t xml:space="preserve">ผ่าน</w:t>
-            </w:r>
-          </w:p>
-        </w:tc>
-      </w:tr>
-      <w:tr>
-        <w:tc>
-          <w:tcPr/>
-          <w:p>
-            <w:pPr>
-              <w:pStyle w:val="Compact"/>
-            </w:pPr>
-            <w:r>
-              <w:t xml:space="preserve">FR-05</w:t>
-            </w:r>
-          </w:p>
-        </w:tc>
-        <w:tc>
-          <w:tcPr/>
-          <w:p>
-            <w:pPr>
-              <w:pStyle w:val="Compact"/>
-            </w:pPr>
-            <w:r>
-              <w:t xml:space="preserve">ยืนยันจ่ายสินค้า</w:t>
-            </w:r>
-          </w:p>
-        </w:tc>
-        <w:tc>
-          <w:tcPr/>
-          <w:p>
-            <w:pPr>
-              <w:pStyle w:val="Compact"/>
-            </w:pPr>
-            <w:r>
-              <w:t xml:space="preserve">UC-07</w:t>
-            </w:r>
-          </w:p>
-        </w:tc>
-        <w:tc>
-          <w:tcPr/>
-          <w:p>
-            <w:pPr>
-              <w:pStyle w:val="Compact"/>
-            </w:pPr>
-            <w:r>
-              <w:t xml:space="preserve">TC-06</w:t>
-            </w:r>
-          </w:p>
-        </w:tc>
-        <w:tc>
-          <w:tcPr/>
-          <w:p>
-            <w:pPr>
-              <w:pStyle w:val="Compact"/>
-            </w:pPr>
-            <w:r>
-              <w:t xml:space="preserve">ผ่าน</w:t>
-            </w:r>
-          </w:p>
-        </w:tc>
-      </w:tr>
-      <w:tr>
-        <w:tc>
-          <w:tcPr/>
-          <w:p>
-            <w:pPr>
-              <w:pStyle w:val="Compact"/>
-            </w:pPr>
-            <w:r>
-              <w:t xml:space="preserve">FR-06</w:t>
-            </w:r>
-          </w:p>
-        </w:tc>
-        <w:tc>
-          <w:tcPr/>
-          <w:p>
-            <w:pPr>
-              <w:pStyle w:val="Compact"/>
-            </w:pPr>
-            <w:r>
-              <w:t xml:space="preserve">ตัดสต็อกแบบอะตอมมิก</w:t>
-            </w:r>
-          </w:p>
-        </w:tc>
-        <w:tc>
-          <w:tcPr/>
-          <w:p>
-            <w:pPr>
-              <w:pStyle w:val="Compact"/>
-            </w:pPr>
-            <w:r>
-              <w:t xml:space="preserve">UC-07</w:t>
-            </w:r>
-          </w:p>
-        </w:tc>
-        <w:tc>
-          <w:tcPr/>
-          <w:p>
-            <w:pPr>
-              <w:pStyle w:val="Compact"/>
-            </w:pPr>
-            <w:r>
-              <w:t xml:space="preserve">TC-07, TC-08</w:t>
-            </w:r>
-          </w:p>
-        </w:tc>
-        <w:tc>
-          <w:tcPr/>
-          <w:p>
-            <w:pPr>
-              <w:pStyle w:val="Compact"/>
-            </w:pPr>
-            <w:r>
-              <w:t xml:space="preserve">ผ่านบางส่วน รอ TC-07</w:t>
-            </w:r>
-          </w:p>
-        </w:tc>
-      </w:tr>
-      <w:tr>
-        <w:tc>
-          <w:tcPr/>
-          <w:p>
-            <w:pPr>
-              <w:pStyle w:val="Compact"/>
-            </w:pPr>
-            <w:r>
-              <w:t xml:space="preserve">FR-07</w:t>
-            </w:r>
-          </w:p>
-        </w:tc>
-        <w:tc>
-          <w:tcPr/>
-          <w:p>
-            <w:pPr>
-              <w:pStyle w:val="Compact"/>
-            </w:pPr>
-            <w:r>
-              <w:t xml:space="preserve">แดชบอร์ดปฏิบัติการและระดับบริหาร</w:t>
-            </w:r>
-          </w:p>
-        </w:tc>
-        <w:tc>
-          <w:tcPr/>
-          <w:p>
-            <w:pPr>
-              <w:pStyle w:val="Compact"/>
-            </w:pPr>
-            <w:r>
-              <w:t xml:space="preserve">UC-08, UC-09</w:t>
-            </w:r>
-          </w:p>
-        </w:tc>
-        <w:tc>
-          <w:tcPr/>
-          <w:p>
-            <w:pPr>
-              <w:pStyle w:val="Compact"/>
-            </w:pPr>
-            <w:r>
-              <w:t xml:space="preserve">TC-09</w:t>
-            </w:r>
-          </w:p>
-        </w:tc>
-        <w:tc>
-          <w:tcPr/>
-          <w:p>
-            <w:pPr>
-              <w:pStyle w:val="Compact"/>
-            </w:pPr>
-            <w:r>
-              <w:t xml:space="preserve">ผ่าน</w:t>
-            </w:r>
-          </w:p>
-        </w:tc>
-      </w:tr>
-      <w:tr>
-        <w:tc>
-          <w:tcPr/>
-          <w:p>
-            <w:pPr>
-              <w:pStyle w:val="Compact"/>
-            </w:pPr>
-            <w:r>
-              <w:t xml:space="preserve">FR-08</w:t>
-            </w:r>
-          </w:p>
-        </w:tc>
-        <w:tc>
-          <w:tcPr/>
-          <w:p>
-            <w:pPr>
-              <w:pStyle w:val="Compact"/>
-            </w:pPr>
-            <w:r>
-              <w:t xml:space="preserve">แจ้งเตือนภายในแอปพลิเคชัน</w:t>
-            </w:r>
-          </w:p>
-        </w:tc>
-        <w:tc>
-          <w:tcPr/>
-          <w:p>
-            <w:pPr>
-              <w:pStyle w:val="Compact"/>
-            </w:pPr>
-            <w:r>
-              <w:t xml:space="preserve">UC-11</w:t>
-            </w:r>
-          </w:p>
-        </w:tc>
-        <w:tc>
-          <w:tcPr/>
-          <w:p>
-            <w:pPr>
-              <w:pStyle w:val="Compact"/>
-            </w:pPr>
-            <w:r>
-              <w:t xml:space="preserve">TC-10, TC-11</w:t>
-            </w:r>
-          </w:p>
-        </w:tc>
-        <w:tc>
-          <w:tcPr/>
-          <w:p>
-            <w:pPr>
-              <w:pStyle w:val="Compact"/>
-            </w:pPr>
-            <w:r>
-              <w:t xml:space="preserve">ผ่าน</w:t>
-            </w:r>
-          </w:p>
-        </w:tc>
-      </w:tr>
-      <w:tr>
-        <w:tc>
-          <w:tcPr/>
-          <w:p>
-            <w:pPr>
-              <w:pStyle w:val="Compact"/>
-            </w:pPr>
-            <w:r>
-              <w:t xml:space="preserve">FR-09</w:t>
-            </w:r>
-          </w:p>
-        </w:tc>
-        <w:tc>
-          <w:tcPr/>
-          <w:p>
-            <w:pPr>
-              <w:pStyle w:val="Compact"/>
-            </w:pPr>
-            <w:r>
-              <w:t xml:space="preserve">บันทึกและค้นหาประวัติการทำรายการ</w:t>
-            </w:r>
-          </w:p>
-        </w:tc>
-        <w:tc>
-          <w:tcPr/>
-          <w:p>
-            <w:pPr>
-              <w:pStyle w:val="Compact"/>
-            </w:pPr>
-            <w:r>
-              <w:t xml:space="preserve">UC-10</w:t>
-            </w:r>
-          </w:p>
-        </w:tc>
-        <w:tc>
-          <w:tcPr/>
-          <w:p>
-            <w:pPr>
-              <w:pStyle w:val="Compact"/>
-            </w:pPr>
-            <w:r>
-              <w:t xml:space="preserve">TC-12</w:t>
-            </w:r>
-          </w:p>
-        </w:tc>
-        <w:tc>
-          <w:tcPr/>
-          <w:p>
-            <w:pPr>
-              <w:pStyle w:val="Compact"/>
-            </w:pPr>
-            <w:r>
-              <w:t xml:space="preserve">ผ่าน</w:t>
-            </w:r>
-          </w:p>
-        </w:tc>
-      </w:tr>
-      <w:tr>
-        <w:tc>
-          <w:tcPr/>
-          <w:p>
-            <w:pPr>
-              <w:pStyle w:val="Compact"/>
-            </w:pPr>
-            <w:r>
-              <w:t xml:space="preserve">NFR-01</w:t>
-            </w:r>
-          </w:p>
-        </w:tc>
-        <w:tc>
-          <w:tcPr/>
-          <w:p>
-            <w:pPr>
-              <w:pStyle w:val="Compact"/>
-            </w:pPr>
-            <w:r>
-              <w:t xml:space="preserve">ความมั่นคงปลอดภัยและ RBAC</w:t>
-            </w:r>
-          </w:p>
-        </w:tc>
-        <w:tc>
-          <w:tcPr/>
-          <w:p>
-            <w:pPr>
-              <w:pStyle w:val="Compact"/>
-            </w:pPr>
-            <w:r>
-              <w:t xml:space="preserve">ทุก UC</w:t>
-            </w:r>
-          </w:p>
-        </w:tc>
-        <w:tc>
-          <w:tcPr/>
-          <w:p>
-            <w:pPr>
-              <w:pStyle w:val="Compact"/>
-            </w:pPr>
-            <w:r>
-              <w:t xml:space="preserve">TC-01</w:t>
-            </w:r>
-          </w:p>
-        </w:tc>
-        <w:tc>
-          <w:tcPr/>
-          <w:p>
-            <w:pPr>
-              <w:pStyle w:val="Compact"/>
-            </w:pPr>
-            <w:r>
-              <w:t xml:space="preserve">ผ่าน 7 จาก 7 รายการ</w:t>
-            </w:r>
-          </w:p>
-        </w:tc>
-      </w:tr>
-      <w:tr>
-        <w:tc>
-          <w:tcPr/>
-          <w:p>
-            <w:pPr>
-              <w:pStyle w:val="Compact"/>
-            </w:pPr>
-            <w:r>
-              <w:t xml:space="preserve">NFR-02</w:t>
-            </w:r>
-          </w:p>
-        </w:tc>
-        <w:tc>
-          <w:tcPr/>
-          <w:p>
-            <w:pPr>
-              <w:pStyle w:val="Compact"/>
-            </w:pPr>
-            <w:r>
-              <w:t xml:space="preserve">ข้อมูลปรากฏบนหน้าจอคิวภายใน 3 วินาที</w:t>
-            </w:r>
-          </w:p>
-        </w:tc>
-        <w:tc>
-          <w:tcPr/>
-          <w:p>
-            <w:pPr>
-              <w:pStyle w:val="Compact"/>
-            </w:pPr>
-            <w:r>
-              <w:t xml:space="preserve">UC-05</w:t>
-            </w:r>
-          </w:p>
-        </w:tc>
-        <w:tc>
-          <w:tcPr/>
-          <w:p>
-            <w:pPr>
-              <w:pStyle w:val="Compact"/>
-            </w:pPr>
-            <w:r>
-              <w:t xml:space="preserve">TC-05</w:t>
-            </w:r>
-          </w:p>
-        </w:tc>
-        <w:tc>
-          <w:tcPr/>
-          <w:p>
-            <w:pPr>
-              <w:pStyle w:val="Compact"/>
-            </w:pPr>
-            <w:r>
-              <w:t xml:space="preserve">ผ่าน สูงสุด 9 ms</w:t>
-            </w:r>
-          </w:p>
-        </w:tc>
-      </w:tr>
-      <w:tr>
-        <w:tc>
-          <w:tcPr/>
-          <w:p>
-            <w:pPr>
-              <w:pStyle w:val="Compact"/>
-            </w:pPr>
-            <w:r>
-              <w:t xml:space="preserve">NFR-03</w:t>
-            </w:r>
-          </w:p>
-        </w:tc>
-        <w:tc>
-          <w:tcPr/>
-          <w:p>
-            <w:pPr>
-              <w:pStyle w:val="Compact"/>
-            </w:pPr>
-            <w:r>
-              <w:t xml:space="preserve">รองรับแท็บเล็ตและสมาร์ตโฟน</w:t>
-            </w:r>
-          </w:p>
-        </w:tc>
-        <w:tc>
-          <w:tcPr/>
-          <w:p>
-            <w:pPr>
-              <w:pStyle w:val="Compact"/>
-            </w:pPr>
-            <w:r>
-              <w:t xml:space="preserve">UC-05, UC-07</w:t>
-            </w:r>
-          </w:p>
-        </w:tc>
-        <w:tc>
-          <w:tcPr/>
-          <w:p>
-            <w:pPr>
-              <w:pStyle w:val="Compact"/>
-            </w:pPr>
-            <w:r>
-              <w:t xml:space="preserve">ตรวจด้วยเบราว์เซอร์จริง</w:t>
-            </w:r>
-          </w:p>
-        </w:tc>
-        <w:tc>
-          <w:tcPr/>
-          <w:p>
-            <w:pPr>
-              <w:pStyle w:val="Compact"/>
-            </w:pPr>
-            <w:r>
-              <w:t xml:space="preserve">ผ่าน</w:t>
-            </w:r>
-          </w:p>
-        </w:tc>
-      </w:tr>
-      <w:tr>
-        <w:tc>
-          <w:tcPr/>
-          <w:p>
-            <w:pPr>
-              <w:pStyle w:val="Compact"/>
-            </w:pPr>
-            <w:r>
-              <w:t xml:space="preserve">NFR-04</w:t>
-            </w:r>
-          </w:p>
-        </w:tc>
-        <w:tc>
-          <w:tcPr/>
-          <w:p>
-            <w:pPr>
-              <w:pStyle w:val="Compact"/>
-            </w:pPr>
-            <w:r>
-              <w:t xml:space="preserve">ทนทานต่อธุรกรรมพร้อมกัน</w:t>
-            </w:r>
-          </w:p>
-        </w:tc>
-        <w:tc>
-          <w:tcPr/>
-          <w:p>
-            <w:pPr>
-              <w:pStyle w:val="Compact"/>
-            </w:pPr>
-            <w:r>
-              <w:t xml:space="preserve">UC-07</w:t>
-            </w:r>
-          </w:p>
-        </w:tc>
-        <w:tc>
-          <w:tcPr/>
-          <w:p>
-            <w:pPr>
-              <w:pStyle w:val="Compact"/>
-            </w:pPr>
-            <w:r>
-              <w:t xml:space="preserve">TC-06, TC-08</w:t>
-            </w:r>
-          </w:p>
-        </w:tc>
-        <w:tc>
-          <w:tcPr/>
-          <w:p>
-            <w:pPr>
-              <w:pStyle w:val="Compact"/>
-            </w:pPr>
-            <w:r>
-              <w:t xml:space="preserve">ผ่าน 300 คำขอ</w:t>
-            </w:r>
-          </w:p>
-        </w:tc>
-      </w:tr>
-      <w:tr>
-        <w:tc>
-          <w:tcPr/>
-          <w:p>
-            <w:pPr>
-              <w:pStyle w:val="Compact"/>
-            </w:pPr>
-            <w:r>
-              <w:t xml:space="preserve">NFR-05</w:t>
-            </w:r>
-          </w:p>
-        </w:tc>
-        <w:tc>
-          <w:tcPr/>
-          <w:p>
-            <w:pPr>
-              <w:pStyle w:val="Compact"/>
-            </w:pPr>
-            <w:r>
-              <w:t xml:space="preserve">พิมพ์ใบเสร็จภายใน 5 วินาที</w:t>
-            </w:r>
-          </w:p>
-        </w:tc>
-        <w:tc>
-          <w:tcPr/>
-          <w:p>
-            <w:pPr>
-              <w:pStyle w:val="Compact"/>
-            </w:pPr>
-            <w:r>
-              <w:t xml:space="preserve">UC-03</w:t>
-            </w:r>
-          </w:p>
-        </w:tc>
-        <w:tc>
-          <w:tcPr/>
-          <w:p>
-            <w:pPr>
-              <w:pStyle w:val="Compact"/>
-            </w:pPr>
-            <w:r>
-              <w:t xml:space="preserve">TC-13</w:t>
-            </w:r>
-          </w:p>
-        </w:tc>
-        <w:tc>
-          <w:tcPr/>
-          <w:p>
-            <w:pPr>
-              <w:pStyle w:val="Compact"/>
-            </w:pPr>
-            <w:r>
-              <w:t xml:space="preserve">ผ่านบางส่วน วัดในโหมดจำลอง</w:t>
-            </w:r>
-          </w:p>
-        </w:tc>
-      </w:tr>
-      <w:tr>
-        <w:tc>
-          <w:tcPr/>
-          <w:p>
-            <w:pPr>
-              <w:pStyle w:val="Compact"/>
-            </w:pPr>
-            <w:r>
-              <w:t xml:space="preserve">NFR-06</w:t>
-            </w:r>
-          </w:p>
-        </w:tc>
-        <w:tc>
-          <w:tcPr/>
-          <w:p>
-            <w:pPr>
-              <w:pStyle w:val="Compact"/>
-            </w:pPr>
-            <w:r>
-              <w:t xml:space="preserve">รองรับพร้อมกันไม่น้อยกว่า 10 เซสชัน</w:t>
-            </w:r>
-          </w:p>
-        </w:tc>
-        <w:tc>
-          <w:tcPr/>
-          <w:p>
-            <w:pPr>
-              <w:pStyle w:val="Compact"/>
-            </w:pPr>
-            <w:r>
-              <w:t xml:space="preserve">ทุก UC</w:t>
-            </w:r>
-          </w:p>
-        </w:tc>
-        <w:tc>
-          <w:tcPr/>
-          <w:p>
-            <w:pPr>
-              <w:pStyle w:val="Compact"/>
-            </w:pPr>
-            <w:r>
-              <w:t xml:space="preserve">TC-14</w:t>
-            </w:r>
-          </w:p>
-        </w:tc>
-        <w:tc>
-          <w:tcPr/>
-          <w:p>
-            <w:pPr>
-              <w:pStyle w:val="Compact"/>
-            </w:pPr>
-            <w:r>
-              <w:t xml:space="preserve">ผ่าน ไม่มีคำขอล้มเหลว</w:t>
-            </w:r>
-          </w:p>
-        </w:tc>
-      </w:tr>
-      <w:tr>
-        <w:tc>
-          <w:tcPr/>
-          <w:p>
-            <w:pPr>
-              <w:pStyle w:val="Compact"/>
-            </w:pPr>
-            <w:r>
-              <w:t xml:space="preserve">NFR-07</w:t>
-            </w:r>
-          </w:p>
-        </w:tc>
-        <w:tc>
-          <w:tcPr/>
-          <w:p>
-            <w:pPr>
-              <w:pStyle w:val="Compact"/>
-            </w:pPr>
-            <w:r>
-              <w:t xml:space="preserve">ทำงานถูกต้องบนเบราว์เซอร์ที่กำหนด</w:t>
-            </w:r>
-          </w:p>
-        </w:tc>
-        <w:tc>
-          <w:tcPr/>
-          <w:p>
-            <w:pPr>
-              <w:pStyle w:val="Compact"/>
-            </w:pPr>
-            <w:r>
-              <w:t xml:space="preserve">ทุก UC</w:t>
-            </w:r>
-          </w:p>
-        </w:tc>
-        <w:tc>
-          <w:tcPr/>
-          <w:p>
-            <w:pPr>
-              <w:pStyle w:val="Compact"/>
-            </w:pPr>
-            <w:r>
-              <w:t xml:space="preserve">เมทริกซ์เบราว์เซอร์</w:t>
-            </w:r>
-          </w:p>
-        </w:tc>
-        <w:tc>
-          <w:tcPr/>
-          <w:p>
-            <w:pPr>
-              <w:pStyle w:val="Compact"/>
-            </w:pPr>
-            <w:r>
-              <w:t xml:space="preserve">ผ่านทั้งสามกลไกเรนเดอร์</w:t>
-            </w:r>
-          </w:p>
-        </w:tc>
-      </w:tr>
-      <w:tr>
-        <w:tc>
-          <w:tcPr/>
-          <w:p>
-            <w:pPr>
-              <w:pStyle w:val="Compact"/>
-            </w:pPr>
-            <w:r>
-              <w:t xml:space="preserve">NFR-08</w:t>
-            </w:r>
-          </w:p>
-        </w:tc>
-        <w:tc>
-          <w:tcPr/>
-          <w:p>
-            <w:pPr>
-              <w:pStyle w:val="Compact"/>
-            </w:pPr>
-            <w:r>
-              <w:t xml:space="preserve">แยกชั้นและแยกส่วนประกอบตามที่ออกแบบ</w:t>
-            </w:r>
-          </w:p>
-        </w:tc>
-        <w:tc>
-          <w:tcPr/>
-          <w:p>
-            <w:pPr>
-              <w:pStyle w:val="Compact"/>
-            </w:pPr>
-            <w:r>
-              <w:t xml:space="preserve">—</w:t>
-            </w:r>
-          </w:p>
-        </w:tc>
-        <w:tc>
-          <w:tcPr/>
-          <w:p>
-            <w:pPr>
-              <w:pStyle w:val="Compact"/>
-            </w:pPr>
-            <w:r>
-              <w:t xml:space="preserve">ตรวจโครงสร้างซอร์สโค้ด</w:t>
-            </w:r>
-          </w:p>
-        </w:tc>
-        <w:tc>
-          <w:tcPr/>
-          <w:p>
-            <w:pPr>
-              <w:pStyle w:val="Compact"/>
-            </w:pPr>
-            <w:r>
-              <w:t xml:space="preserve">ผ่าน</w:t>
-            </w:r>
-          </w:p>
-        </w:tc>
-      </w:tr>
-      <w:tr>
-        <w:tc>
-          <w:tcPr/>
-          <w:p>
-            <w:pPr>
-              <w:pStyle w:val="Compact"/>
-            </w:pPr>
-            <w:r>
-              <w:t xml:space="preserve">NFR-09</w:t>
-            </w:r>
-          </w:p>
-        </w:tc>
-        <w:tc>
-          <w:tcPr/>
-          <w:p>
-            <w:pPr>
-              <w:pStyle w:val="Compact"/>
-            </w:pPr>
-            <w:r>
-              <w:t xml:space="preserve">ติดตั้งซ้ำได้ด้วยเอกสารเพียงอย่างเดียว</w:t>
-            </w:r>
-          </w:p>
-        </w:tc>
-        <w:tc>
-          <w:tcPr/>
-          <w:p>
-            <w:pPr>
-              <w:pStyle w:val="Compact"/>
-            </w:pPr>
-            <w:r>
-              <w:t xml:space="preserve">—</w:t>
-            </w:r>
-          </w:p>
-        </w:tc>
-        <w:tc>
-          <w:tcPr/>
-          <w:p>
-            <w:pPr>
-              <w:pStyle w:val="Compact"/>
-            </w:pPr>
-            <w:r>
-              <w:t xml:space="preserve">ติดตั้งตามคู่มือ</w:t>
-            </w:r>
-          </w:p>
-        </w:tc>
-        <w:tc>
-          <w:tcPr/>
-          <w:p>
-            <w:pPr>
-              <w:pStyle w:val="Compact"/>
-            </w:pPr>
-            <w:r>
-              <w:t xml:space="preserve">ผ่านบางส่วน รอผู้ทวนสอบภายนอก</w:t>
-            </w:r>
-          </w:p>
-        </w:tc>
-      </w:tr>
-    </w:tbl>
     <w:p>
       <w:r>
         <w:pict>
@@ -19474,9 +18229,9 @@
         </w:pict>
       </w:r>
     </w:p>
-    <w:bookmarkEnd w:id="135"/>
-    <w:bookmarkEnd w:id="136"/>
-    <w:bookmarkStart w:id="137" w:name="appendix-f-completeness-and-qa-record"/>
+    <w:bookmarkEnd w:id="128"/>
+    <w:bookmarkEnd w:id="129"/>
+    <w:bookmarkStart w:id="130" w:name="appendix-f-completeness-and-qa-record"/>
     <w:p>
       <w:pPr>
         <w:pStyle w:val="Heading1"/>
@@ -19858,7 +18613,7 @@
               <w:pStyle w:val="Compact"/>
             </w:pPr>
             <w:r>
-              <w:t xml:space="preserve">แผนภาพประกอบครบตามที่ต้นแบบกำหนด</w:t>
+              <w:t xml:space="preserve">แผนภาพประกอบครบตามช่องที่ต้นแบบกำหนด</w:t>
             </w:r>
           </w:p>
         </w:tc>
@@ -19880,7 +18635,7 @@
               <w:pStyle w:val="Compact"/>
             </w:pPr>
             <w:r>
-              <w:t xml:space="preserve">ภาพที่ 1–9 ครอบคลุมบริบท คอนเทนเนอร์ กรณีการใช้งานสี่กลุ่ม ลำดับการจ่ายสินค้า วงจรชีวิตคำสั่งซื้อ และแบบจำลองข้อมูล</w:t>
+              <w:t xml:space="preserve">ภาพที่ 1–7 คือแผนภาพบริบท กรณีการใช้งานสี่กลุ่ม วงจรชีวิตคำสั่งซื้อ และแบบจำลองข้อมูล</w:t>
             </w:r>
           </w:p>
         </w:tc>
@@ -20203,7 +18958,7 @@
         <w:t xml:space="preserve">จบเอกสาร Use Case SRS — ระบบ SOML</w:t>
       </w:r>
     </w:p>
-    <w:bookmarkEnd w:id="137"/>
+    <w:bookmarkEnd w:id="130"/>
     <w:sectPr>
       <w:footnotePr>
         <w:numRestart w:val="eachSect"/>

</xml_diff>

<commit_message>
Cite only the documents the reader has
The reference table listed seven items, four of which are not part of what
gets handed over with this document: the course template, chapters 3 and 4,
and the evidence folder. It now lists chapter 1, chapter 2, and the standard
SRS, as requested.

Seven places in the body cited chapter 3 or chapter 4 as their source, which
would have pointed the reader at documents no longer in the list. Each now
states the fact directly or cites REF-03, and the revision history names its
phases rather than chapters.

Checked the built file line by line against the Markdown: all 101 headings,
83 tables, 7 figures and every line of text are present, Appendix F included.

Co-Authored-By: Claude Opus 5 <noreply@anthropic.com>
Claude-Session: https://claude.ai/code/session_01VK1RWMhqrGAHMFf4HNf3qn
</commit_message>
<xml_diff>
--- a/Documents/UseCase_SRS_SOML_ENGSE206_v1.0_TH.docx
+++ b/Documents/UseCase_SRS_SOML_ENGSE206_v1.0_TH.docx
@@ -1139,7 +1139,7 @@
               <w:pStyle w:val="Compact"/>
             </w:pPr>
             <w:r>
-              <w:t xml:space="preserve">บทที่ 1–2</w:t>
+              <w:t xml:space="preserve">ระยะเก็บความต้องการ</w:t>
             </w:r>
           </w:p>
         </w:tc>
@@ -1185,7 +1185,7 @@
               <w:pStyle w:val="Compact"/>
             </w:pPr>
             <w:r>
-              <w:t xml:space="preserve">บทที่ 3</w:t>
+              <w:t xml:space="preserve">ระยะออกแบบ</w:t>
             </w:r>
           </w:p>
         </w:tc>
@@ -1628,7 +1628,7 @@
               <w:pStyle w:val="Compact"/>
             </w:pPr>
             <w:r>
-              <w:t xml:space="preserve">Test Case ตามแผนการทดสอบในบทที่ 3</w:t>
+              <w:t xml:space="preserve">Test Case ตามแผนการทดสอบของโครงงาน</w:t>
             </w:r>
           </w:p>
         </w:tc>
@@ -1735,7 +1735,7 @@
         <w:pStyle w:val="BodyText"/>
       </w:pPr>
       <w:r>
-        <w:t xml:space="preserve">รหัสความต้องการ FR, NFR, BR และ UC ในเอกสารนี้ใช้หมายเลขเดียวกับที่ปรากฏในบทที่ 3 ของปริญญานิพนธ์ทุกประการ เพื่อให้อ้างอิงข้ามเอกสารได้โดยไม่ต้องแปลงรหัส ส่วนรหัส EV, US, AC, M, CON และ TBD เพิ่มขึ้นใหม่ในเอกสารฉบับนี้ตามโครงสร้างของแบบฟอร์ม</w:t>
+        <w:t xml:space="preserve">รหัสความต้องการ FR, NFR, BR และ UC ในเอกสารนี้ใช้หมายเลขเดียวกับที่ปรากฏในเอกสารข้อกำหนดความต้องการฉบับมาตรฐานตาม REF-03 ทุกประการ เพื่อให้อ้างอิงข้ามเอกสารได้โดยไม่ต้องแปลงรหัส ส่วนรหัส EV, US, AC, M, CON และ TBD เพิ่มขึ้นใหม่ในเอกสารฉบับนี้ตามโครงสร้างของแบบฟอร์ม</w:t>
       </w:r>
     </w:p>
     <w:bookmarkEnd w:id="37"/>
@@ -2352,18 +2352,18 @@
               <w:pStyle w:val="Compact"/>
             </w:pPr>
             <w:r>
-              <w:t xml:space="preserve">ENGSE206_CaseX_SRS_v1.0_TH.docx</w:t>
-            </w:r>
-          </w:p>
-        </w:tc>
-        <w:tc>
-          <w:tcPr/>
-          <w:p>
-            <w:pPr>
-              <w:pStyle w:val="Compact"/>
-            </w:pPr>
-            <w:r>
-              <w:t xml:space="preserve">โครงสร้างหัวข้อหลักของเอกสารฉบับนี้</w:t>
+              <w:t xml:space="preserve">ปริญญานิพนธ์ SE02 บทที่ 1</w:t>
+            </w:r>
+          </w:p>
+        </w:tc>
+        <w:tc>
+          <w:tcPr/>
+          <w:p>
+            <w:pPr>
+              <w:pStyle w:val="Compact"/>
+            </w:pPr>
+            <w:r>
+              <w:t xml:space="preserve">ที่มาของปัญหา EV-01..09 วัตถุประสงค์ และขอบเขตของโครงงาน</w:t>
             </w:r>
           </w:p>
         </w:tc>
@@ -2387,18 +2387,18 @@
               <w:pStyle w:val="Compact"/>
             </w:pPr>
             <w:r>
-              <w:t xml:space="preserve">ปริญญานิพนธ์ SE02 บทที่ 1</w:t>
-            </w:r>
-          </w:p>
-        </w:tc>
-        <w:tc>
-          <w:tcPr/>
-          <w:p>
-            <w:pPr>
-              <w:pStyle w:val="Compact"/>
-            </w:pPr>
-            <w:r>
-              <w:t xml:space="preserve">ที่มาของปัญหา EV-01..09 วัตถุประสงค์ และขอบเขต</w:t>
+              <w:t xml:space="preserve">ปริญญานิพนธ์ SE02 บทที่ 2</w:t>
+            </w:r>
+          </w:p>
+        </w:tc>
+        <w:tc>
+          <w:tcPr/>
+          <w:p>
+            <w:pPr>
+              <w:pStyle w:val="Compact"/>
+            </w:pPr>
+            <w:r>
+              <w:t xml:space="preserve">ทฤษฎีและงานที่เกี่ยวข้องซึ่งใช้อ้างอิงการออกแบบ</w:t>
             </w:r>
           </w:p>
         </w:tc>
@@ -2412,111 +2412,6 @@
             </w:pPr>
             <w:r>
               <w:t xml:space="preserve">REF-03</w:t>
-            </w:r>
-          </w:p>
-        </w:tc>
-        <w:tc>
-          <w:tcPr/>
-          <w:p>
-            <w:pPr>
-              <w:pStyle w:val="Compact"/>
-            </w:pPr>
-            <w:r>
-              <w:t xml:space="preserve">ปริญญานิพนธ์ SE02 บทที่ 2</w:t>
-            </w:r>
-          </w:p>
-        </w:tc>
-        <w:tc>
-          <w:tcPr/>
-          <w:p>
-            <w:pPr>
-              <w:pStyle w:val="Compact"/>
-            </w:pPr>
-            <w:r>
-              <w:t xml:space="preserve">ทฤษฎีและงานที่เกี่ยวข้องซึ่งใช้อ้างอิงการออกแบบ</w:t>
-            </w:r>
-          </w:p>
-        </w:tc>
-      </w:tr>
-      <w:tr>
-        <w:tc>
-          <w:tcPr/>
-          <w:p>
-            <w:pPr>
-              <w:pStyle w:val="Compact"/>
-            </w:pPr>
-            <w:r>
-              <w:t xml:space="preserve">REF-04</w:t>
-            </w:r>
-          </w:p>
-        </w:tc>
-        <w:tc>
-          <w:tcPr/>
-          <w:p>
-            <w:pPr>
-              <w:pStyle w:val="Compact"/>
-            </w:pPr>
-            <w:r>
-              <w:t xml:space="preserve">ปริญญานิพนธ์ SE02 บทที่ 3</w:t>
-            </w:r>
-          </w:p>
-        </w:tc>
-        <w:tc>
-          <w:tcPr/>
-          <w:p>
-            <w:pPr>
-              <w:pStyle w:val="Compact"/>
-            </w:pPr>
-            <w:r>
-              <w:t xml:space="preserve">FR/NFR, UC-01..11, ERD, C4 Model และแผนการทดสอบ</w:t>
-            </w:r>
-          </w:p>
-        </w:tc>
-      </w:tr>
-      <w:tr>
-        <w:tc>
-          <w:tcPr/>
-          <w:p>
-            <w:pPr>
-              <w:pStyle w:val="Compact"/>
-            </w:pPr>
-            <w:r>
-              <w:t xml:space="preserve">REF-05</w:t>
-            </w:r>
-          </w:p>
-        </w:tc>
-        <w:tc>
-          <w:tcPr/>
-          <w:p>
-            <w:pPr>
-              <w:pStyle w:val="Compact"/>
-            </w:pPr>
-            <w:r>
-              <w:t xml:space="preserve">ปริญญานิพนธ์ SE02 บทที่ 4</w:t>
-            </w:r>
-          </w:p>
-        </w:tc>
-        <w:tc>
-          <w:tcPr/>
-          <w:p>
-            <w:pPr>
-              <w:pStyle w:val="Compact"/>
-            </w:pPr>
-            <w:r>
-              <w:t xml:space="preserve">ผลการทดสอบจริงที่อ้างอิงในเอกสารนี้</w:t>
-            </w:r>
-          </w:p>
-        </w:tc>
-      </w:tr>
-      <w:tr>
-        <w:tc>
-          <w:tcPr/>
-          <w:p>
-            <w:pPr>
-              <w:pStyle w:val="Compact"/>
-            </w:pPr>
-            <w:r>
-              <w:t xml:space="preserve">REF-06</w:t>
             </w:r>
           </w:p>
         </w:tc>
@@ -2547,42 +2442,7 @@
               <w:pStyle w:val="Compact"/>
             </w:pPr>
             <w:r>
-              <w:t xml:space="preserve">ฉบับคู่กันของโครงงาน ใช้รหัสความต้องการชุดเดียวกัน</w:t>
-            </w:r>
-          </w:p>
-        </w:tc>
-      </w:tr>
-      <w:tr>
-        <w:tc>
-          <w:tcPr/>
-          <w:p>
-            <w:pPr>
-              <w:pStyle w:val="Compact"/>
-            </w:pPr>
-            <w:r>
-              <w:t xml:space="preserve">REF-07</w:t>
-            </w:r>
-          </w:p>
-        </w:tc>
-        <w:tc>
-          <w:tcPr/>
-          <w:p>
-            <w:pPr>
-              <w:pStyle w:val="Compact"/>
-            </w:pPr>
-            <w:r>
-              <w:t xml:space="preserve">app/evidence/</w:t>
-            </w:r>
-          </w:p>
-        </w:tc>
-        <w:tc>
-          <w:tcPr/>
-          <w:p>
-            <w:pPr>
-              <w:pStyle w:val="Compact"/>
-            </w:pPr>
-            <w:r>
-              <w:t xml:space="preserve">ไฟล์หลักฐานผลการทดสอบที่อ้างอิงทุกตัวเลข</w:t>
+              <w:t xml:space="preserve">เอกสารข้อกำหนดความต้องการฉบับคู่กันของโครงงาน ใช้รหัสความต้องการชุดเดียวกัน</w:t>
             </w:r>
           </w:p>
         </w:tc>
@@ -5734,7 +5594,7 @@
         <w:pStyle w:val="FirstParagraph"/>
       </w:pPr>
       <w:r>
-        <w:t xml:space="preserve">ส่วนนี้จัดตามเป้าหมายของผู้ใช้และกรณีการใช้งาน ตามที่แบบฟอร์ม IEEE อนุญาต โดยคงรหัสความต้องการเดิมจากบทที่ 3</w:t>
+        <w:t xml:space="preserve">ส่วนนี้จัดตามเป้าหมายของผู้ใช้และกรณีการใช้งาน ตามที่แบบฟอร์ม IEEE อนุญาต โดยคงรหัสความต้องการเดิมของโครงงาน</w:t>
       </w:r>
     </w:p>
     <w:p>
@@ -17518,7 +17378,7 @@
         <w:pStyle w:val="BodyText"/>
       </w:pPr>
       <w:r>
-        <w:t xml:space="preserve">แผนภาพประกอบอื่นของแบบจำลองเหล่านี้อยู่ในบทที่ 3 ของปริญญานิพนธ์ ได้แก่ แผนภาพส่วนประกอบภายในระบบหลังบ้าน แผนภาพลำดับของการสร้างคำสั่งซื้อ และแผนภาพกิจกรรมของกระบวนการทั้งหมด</w:t>
+        <w:t xml:space="preserve">แบบจำลองเหล่านี้ยังมีแผนภาพประกอบอื่นในเอกสารการออกแบบของโครงงาน ได้แก่ แผนภาพส่วนประกอบภายในระบบหลังบ้าน แผนภาพลำดับของการสร้างคำสั่งซื้อ และแผนภาพกิจกรรมของกระบวนการทั้งหมด</w:t>
       </w:r>
     </w:p>
     <w:p>
@@ -21243,7 +21103,7 @@
               <w:pStyle w:val="Compact"/>
             </w:pPr>
             <w:r>
-              <w:t xml:space="preserve">รหัสความต้องการตรงกับบทที่ 3 ของปริญญานิพนธ์</w:t>
+              <w:t xml:space="preserve">รหัสความต้องการตรงกับเอกสารข้อกำหนดฉบับมาตรฐาน</w:t>
             </w:r>
           </w:p>
         </w:tc>

</xml_diff>

<commit_message>
Trace all four objectives, not two
Sections 4.3 and 4.7 carry the capabilities that answer objectives 1.2.1 and
1.2.4, but neither said so, while 1.2.2 and 1.2.3 were named where they are
met. One sentence each closes the gap, so every objective in chapter 1 can
be followed into the use case that delivers it.

Co-Authored-By: Claude Opus 5 <noreply@anthropic.com>
Claude-Session: https://claude.ai/code/session_01VK1RWMhqrGAHMFf4HNf3qn
</commit_message>
<xml_diff>
--- a/Documents/UseCase_SRS_SOML_ENGSE206_v1.0_TH.docx
+++ b/Documents/UseCase_SRS_SOML_ENGSE206_v1.0_TH.docx
@@ -6848,6 +6848,14 @@
         <w:t xml:space="preserve">4.3 สร้างคำสั่งซื้อ รับชำระ และออกใบเสร็จ — UC-03, UC-04</w:t>
       </w:r>
     </w:p>
+    <w:p>
+      <w:pPr>
+        <w:pStyle w:val="FirstParagraph"/>
+      </w:pPr>
+      <w:r>
+        <w:t xml:space="preserve">หัวข้อนี้แทนที่การบันทึกการขายด้วยบิลกระดาษที่ไม่มีระบบยืนยัน จึงเป็นจุดที่ตอบวัตถุประสงค์ข้อ 1.2.1 โดยตรง</w:t>
+      </w:r>
+    </w:p>
     <w:tbl>
       <w:tblPr>
         <w:tblStyle w:val="TableGrid"/>
@@ -10298,6 +10306,14 @@
       </w:pPr>
       <w:r>
         <w:t xml:space="preserve">4.7 แดชบอร์ดปฏิบัติการและระดับบริหาร — UC-08, UC-09</w:t>
+      </w:r>
+    </w:p>
+    <w:p>
+      <w:pPr>
+        <w:pStyle w:val="FirstParagraph"/>
+      </w:pPr>
+      <w:r>
+        <w:t xml:space="preserve">หัวข้อนี้ทำให้ผู้บริหารเห็นสถานการณ์ระหว่างวันแทนการรอสรุปตอนท้ายวัน จึงเป็นจุดที่ตอบวัตถุประสงค์ข้อ 1.2.4 โดยตรง</w:t>
       </w:r>
     </w:p>
     <w:tbl>

</xml_diff>

<commit_message>
Size Thai text the same as Latin, and ship PDFs
Thai is a complex script, so Word sizes it from szCs, not sz. The Case X
reference document sets sz alone on most styles and relies on each paragraph
carrying its own szCs, which our generated paragraphs do not. Thai therefore
rendered several points smaller than the Latin beside it — visible in every
table on the cover page. szCs now follows sz for every style.

Added the PDFs. They embed TH Sarabun New, so they read the same on any
machine whether or not the font is installed, which the .docx cannot promise.

Co-Authored-By: Claude Opus 5 <noreply@anthropic.com>
Claude-Session: https://claude.ai/code/session_01VK1RWMhqrGAHMFf4HNf3qn
</commit_message>
<xml_diff>
--- a/Documents/UseCase_SRS_SOML_ENGSE206_v1.0_TH.docx
+++ b/Documents/UseCase_SRS_SOML_ENGSE206_v1.0_TH.docx
@@ -21429,6 +21429,7 @@
       <w:rFonts w:ascii="TH Sarabun New" w:eastAsia="TH Sarabun New" w:hAnsi="TH Sarabun New"/>
       <w:color w:val="183B63"/>
       <w:sz w:val="30"/>
+      <w:szCs w:val="30"/>
     </w:rPr>
   </w:style>
   <w:style w:styleId="Heading1" w:type="paragraph">
@@ -21450,7 +21451,7 @@
       <w:b/>
       <w:bCs/>
       <w:sz w:val="48"/>
-      <w:szCs w:val="28"/>
+      <w:szCs w:val="48"/>
     </w:rPr>
   </w:style>
   <w:style w:styleId="Heading2" w:type="paragraph">
@@ -21474,7 +21475,7 @@
       <w:bCs/>
       <w:color w:val="176B87"/>
       <w:sz w:val="38"/>
-      <w:szCs w:val="26"/>
+      <w:szCs w:val="38"/>
     </w:rPr>
   </w:style>
   <w:style w:styleId="Heading3" w:type="paragraph">
@@ -21498,6 +21499,7 @@
       <w:bCs/>
       <w:color w:val="E28A2B"/>
       <w:sz w:val="32"/>
+      <w:szCs w:val="32"/>
     </w:rPr>
   </w:style>
   <w:style w:styleId="Heading4" w:type="paragraph">
@@ -21785,7 +21787,7 @@
       <w:spacing w:val="5"/>
       <w:kern w:val="28"/>
       <w:sz w:val="72"/>
-      <w:szCs w:val="52"/>
+      <w:szCs w:val="72"/>
     </w:rPr>
   </w:style>
   <w:style w:customStyle="1" w:styleId="TitleChar" w:type="character">
@@ -21826,7 +21828,7 @@
       <w:color w:val="176B87"/>
       <w:spacing w:val="15"/>
       <w:sz w:val="44"/>
-      <w:szCs w:val="24"/>
+      <w:szCs w:val="44"/>
     </w:rPr>
   </w:style>
   <w:style w:customStyle="1" w:styleId="SubtitleChar" w:type="character">
@@ -32607,6 +32609,7 @@
     <w:rPr>
       <w:rFonts w:ascii="Consolas" w:hAnsi="Consolas"/>
       <w:sz w:val="22"/>
+      <w:szCs w:val="22"/>
     </w:rPr>
   </w:style>
   <w:style w:customStyle="1" w:styleId="SectionNumber" w:type="character">

</xml_diff>